<commit_message>
docs: diagrams in the algorithm description (data flow, measurement update, GNSS states)
Co-Authored-By: Claude Opus 5.5 <noreply@anthropic.com>
</commit_message>
<xml_diff>
--- a/docs/AHRS-Algorithmus.docx
+++ b/docs/AHRS-Algorithmus.docx
@@ -74,7 +74,7 @@
       <w:r>
         <w:fldChar w:fldCharType="separate"/>
       </w:r>
-      <w:hyperlink w:anchor="_Toc242031829" w:history="1">
+      <w:hyperlink w:anchor="_Toc242137754" w:history="1">
         <w:r>
           <w:rPr>
             <w:rStyle w:val="Hyperlink"/>
@@ -101,7 +101,7 @@
             <w:noProof/>
             <w:webHidden/>
           </w:rPr>
-          <w:instrText xml:space="preserve"> PAGEREF _Toc242031829 \h </w:instrText>
+          <w:instrText xml:space="preserve"> PAGEREF _Toc242137754 \h </w:instrText>
         </w:r>
         <w:r>
           <w:rPr>
@@ -143,7 +143,7 @@
           <w:szCs w:val="22"/>
         </w:rPr>
       </w:pPr>
-      <w:hyperlink w:anchor="_Toc242031830" w:history="1">
+      <w:hyperlink w:anchor="_Toc242137755" w:history="1">
         <w:r>
           <w:rPr>
             <w:rStyle w:val="Hyperlink"/>
@@ -170,7 +170,7 @@
             <w:noProof/>
             <w:webHidden/>
           </w:rPr>
-          <w:instrText xml:space="preserve"> PAGEREF _Toc242031830 \h </w:instrText>
+          <w:instrText xml:space="preserve"> PAGEREF _Toc242137755 \h </w:instrText>
         </w:r>
         <w:r>
           <w:rPr>
@@ -212,7 +212,7 @@
           <w:szCs w:val="22"/>
         </w:rPr>
       </w:pPr>
-      <w:hyperlink w:anchor="_Toc242031831" w:history="1">
+      <w:hyperlink w:anchor="_Toc242137756" w:history="1">
         <w:r>
           <w:rPr>
             <w:rStyle w:val="Hyperlink"/>
@@ -239,7 +239,7 @@
             <w:noProof/>
             <w:webHidden/>
           </w:rPr>
-          <w:instrText xml:space="preserve"> PAGEREF _Toc242031831 \h </w:instrText>
+          <w:instrText xml:space="preserve"> PAGEREF _Toc242137756 \h </w:instrText>
         </w:r>
         <w:r>
           <w:rPr>
@@ -259,7 +259,7 @@
             <w:noProof/>
             <w:webHidden/>
           </w:rPr>
-          <w:t>3</w:t>
+          <w:t>4</w:t>
         </w:r>
         <w:r>
           <w:rPr>
@@ -280,7 +280,7 @@
           <w:szCs w:val="22"/>
         </w:rPr>
       </w:pPr>
-      <w:hyperlink w:anchor="_Toc242031832" w:history="1">
+      <w:hyperlink w:anchor="_Toc242137757" w:history="1">
         <w:r>
           <w:rPr>
             <w:rStyle w:val="Hyperlink"/>
@@ -307,7 +307,7 @@
             <w:noProof/>
             <w:webHidden/>
           </w:rPr>
-          <w:instrText xml:space="preserve"> PAGEREF _Toc242031832 \h </w:instrText>
+          <w:instrText xml:space="preserve"> PAGEREF _Toc242137757 \h </w:instrText>
         </w:r>
         <w:r>
           <w:rPr>
@@ -327,7 +327,7 @@
             <w:noProof/>
             <w:webHidden/>
           </w:rPr>
-          <w:t>3</w:t>
+          <w:t>4</w:t>
         </w:r>
         <w:r>
           <w:rPr>
@@ -348,7 +348,7 @@
           <w:szCs w:val="22"/>
         </w:rPr>
       </w:pPr>
-      <w:hyperlink w:anchor="_Toc242031833" w:history="1">
+      <w:hyperlink w:anchor="_Toc242137758" w:history="1">
         <w:r>
           <w:rPr>
             <w:rStyle w:val="Hyperlink"/>
@@ -375,7 +375,7 @@
             <w:noProof/>
             <w:webHidden/>
           </w:rPr>
-          <w:instrText xml:space="preserve"> PAGEREF _Toc242031833 \h </w:instrText>
+          <w:instrText xml:space="preserve"> PAGEREF _Toc242137758 \h </w:instrText>
         </w:r>
         <w:r>
           <w:rPr>
@@ -417,7 +417,7 @@
           <w:szCs w:val="22"/>
         </w:rPr>
       </w:pPr>
-      <w:hyperlink w:anchor="_Toc242031834" w:history="1">
+      <w:hyperlink w:anchor="_Toc242137759" w:history="1">
         <w:r>
           <w:rPr>
             <w:rStyle w:val="Hyperlink"/>
@@ -444,7 +444,7 @@
             <w:noProof/>
             <w:webHidden/>
           </w:rPr>
-          <w:instrText xml:space="preserve"> PAGEREF _Toc242031834 \h </w:instrText>
+          <w:instrText xml:space="preserve"> PAGEREF _Toc242137759 \h </w:instrText>
         </w:r>
         <w:r>
           <w:rPr>
@@ -485,7 +485,7 @@
           <w:szCs w:val="22"/>
         </w:rPr>
       </w:pPr>
-      <w:hyperlink w:anchor="_Toc242031835" w:history="1">
+      <w:hyperlink w:anchor="_Toc242137760" w:history="1">
         <w:r>
           <w:rPr>
             <w:rStyle w:val="Hyperlink"/>
@@ -512,7 +512,7 @@
             <w:noProof/>
             <w:webHidden/>
           </w:rPr>
-          <w:instrText xml:space="preserve"> PAGEREF _Toc242031835 \h </w:instrText>
+          <w:instrText xml:space="preserve"> PAGEREF _Toc242137760 \h </w:instrText>
         </w:r>
         <w:r>
           <w:rPr>
@@ -553,7 +553,7 @@
           <w:szCs w:val="22"/>
         </w:rPr>
       </w:pPr>
-      <w:hyperlink w:anchor="_Toc242031836" w:history="1">
+      <w:hyperlink w:anchor="_Toc242137761" w:history="1">
         <w:r>
           <w:rPr>
             <w:rStyle w:val="Hyperlink"/>
@@ -580,7 +580,7 @@
             <w:noProof/>
             <w:webHidden/>
           </w:rPr>
-          <w:instrText xml:space="preserve"> PAGEREF _Toc242031836 \h </w:instrText>
+          <w:instrText xml:space="preserve"> PAGEREF _Toc242137761 \h </w:instrText>
         </w:r>
         <w:r>
           <w:rPr>
@@ -600,7 +600,7 @@
             <w:noProof/>
             <w:webHidden/>
           </w:rPr>
-          <w:t>4</w:t>
+          <w:t>5</w:t>
         </w:r>
         <w:r>
           <w:rPr>
@@ -622,7 +622,7 @@
           <w:szCs w:val="22"/>
         </w:rPr>
       </w:pPr>
-      <w:hyperlink w:anchor="_Toc242031837" w:history="1">
+      <w:hyperlink w:anchor="_Toc242137762" w:history="1">
         <w:r>
           <w:rPr>
             <w:rStyle w:val="Hyperlink"/>
@@ -649,7 +649,7 @@
             <w:noProof/>
             <w:webHidden/>
           </w:rPr>
-          <w:instrText xml:space="preserve"> PAGEREF _Toc242031837 \h </w:instrText>
+          <w:instrText xml:space="preserve"> PAGEREF _Toc242137762 \h </w:instrText>
         </w:r>
         <w:r>
           <w:rPr>
@@ -690,7 +690,7 @@
           <w:szCs w:val="22"/>
         </w:rPr>
       </w:pPr>
-      <w:hyperlink w:anchor="_Toc242031838" w:history="1">
+      <w:hyperlink w:anchor="_Toc242137763" w:history="1">
         <w:r>
           <w:rPr>
             <w:rStyle w:val="Hyperlink"/>
@@ -717,7 +717,7 @@
             <w:noProof/>
             <w:webHidden/>
           </w:rPr>
-          <w:instrText xml:space="preserve"> PAGEREF _Toc242031838 \h </w:instrText>
+          <w:instrText xml:space="preserve"> PAGEREF _Toc242137763 \h </w:instrText>
         </w:r>
         <w:r>
           <w:rPr>
@@ -758,7 +758,7 @@
           <w:szCs w:val="22"/>
         </w:rPr>
       </w:pPr>
-      <w:hyperlink w:anchor="_Toc242031839" w:history="1">
+      <w:hyperlink w:anchor="_Toc242137764" w:history="1">
         <w:r>
           <w:rPr>
             <w:rStyle w:val="Hyperlink"/>
@@ -785,7 +785,7 @@
             <w:noProof/>
             <w:webHidden/>
           </w:rPr>
-          <w:instrText xml:space="preserve"> PAGEREF _Toc242031839 \h </w:instrText>
+          <w:instrText xml:space="preserve"> PAGEREF _Toc242137764 \h </w:instrText>
         </w:r>
         <w:r>
           <w:rPr>
@@ -805,7 +805,7 @@
             <w:noProof/>
             <w:webHidden/>
           </w:rPr>
-          <w:t>5</w:t>
+          <w:t>6</w:t>
         </w:r>
         <w:r>
           <w:rPr>
@@ -826,7 +826,7 @@
           <w:szCs w:val="22"/>
         </w:rPr>
       </w:pPr>
-      <w:hyperlink w:anchor="_Toc242031840" w:history="1">
+      <w:hyperlink w:anchor="_Toc242137765" w:history="1">
         <w:r>
           <w:rPr>
             <w:rStyle w:val="Hyperlink"/>
@@ -853,7 +853,7 @@
             <w:noProof/>
             <w:webHidden/>
           </w:rPr>
-          <w:instrText xml:space="preserve"> PAGEREF _Toc242031840 \h </w:instrText>
+          <w:instrText xml:space="preserve"> PAGEREF _Toc242137765 \h </w:instrText>
         </w:r>
         <w:r>
           <w:rPr>
@@ -873,7 +873,7 @@
             <w:noProof/>
             <w:webHidden/>
           </w:rPr>
-          <w:t>5</w:t>
+          <w:t>6</w:t>
         </w:r>
         <w:r>
           <w:rPr>
@@ -895,7 +895,7 @@
           <w:szCs w:val="22"/>
         </w:rPr>
       </w:pPr>
-      <w:hyperlink w:anchor="_Toc242031841" w:history="1">
+      <w:hyperlink w:anchor="_Toc242137766" w:history="1">
         <w:r>
           <w:rPr>
             <w:rStyle w:val="Hyperlink"/>
@@ -922,7 +922,7 @@
             <w:noProof/>
             <w:webHidden/>
           </w:rPr>
-          <w:instrText xml:space="preserve"> PAGEREF _Toc242031841 \h </w:instrText>
+          <w:instrText xml:space="preserve"> PAGEREF _Toc242137766 \h </w:instrText>
         </w:r>
         <w:r>
           <w:rPr>
@@ -942,7 +942,7 @@
             <w:noProof/>
             <w:webHidden/>
           </w:rPr>
-          <w:t>5</w:t>
+          <w:t>7</w:t>
         </w:r>
         <w:r>
           <w:rPr>
@@ -963,7 +963,7 @@
           <w:szCs w:val="22"/>
         </w:rPr>
       </w:pPr>
-      <w:hyperlink w:anchor="_Toc242031842" w:history="1">
+      <w:hyperlink w:anchor="_Toc242137767" w:history="1">
         <w:r>
           <w:rPr>
             <w:rStyle w:val="Hyperlink"/>
@@ -990,7 +990,7 @@
             <w:noProof/>
             <w:webHidden/>
           </w:rPr>
-          <w:instrText xml:space="preserve"> PAGEREF _Toc242031842 \h </w:instrText>
+          <w:instrText xml:space="preserve"> PAGEREF _Toc242137767 \h </w:instrText>
         </w:r>
         <w:r>
           <w:rPr>
@@ -1010,7 +1010,7 @@
             <w:noProof/>
             <w:webHidden/>
           </w:rPr>
-          <w:t>5</w:t>
+          <w:t>7</w:t>
         </w:r>
         <w:r>
           <w:rPr>
@@ -1031,7 +1031,7 @@
           <w:szCs w:val="22"/>
         </w:rPr>
       </w:pPr>
-      <w:hyperlink w:anchor="_Toc242031843" w:history="1">
+      <w:hyperlink w:anchor="_Toc242137768" w:history="1">
         <w:r>
           <w:rPr>
             <w:rStyle w:val="Hyperlink"/>
@@ -1058,7 +1058,7 @@
             <w:noProof/>
             <w:webHidden/>
           </w:rPr>
-          <w:instrText xml:space="preserve"> PAGEREF _Toc242031843 \h </w:instrText>
+          <w:instrText xml:space="preserve"> PAGEREF _Toc242137768 \h </w:instrText>
         </w:r>
         <w:r>
           <w:rPr>
@@ -1078,7 +1078,7 @@
             <w:noProof/>
             <w:webHidden/>
           </w:rPr>
-          <w:t>6</w:t>
+          <w:t>7</w:t>
         </w:r>
         <w:r>
           <w:rPr>
@@ -1100,7 +1100,7 @@
           <w:szCs w:val="22"/>
         </w:rPr>
       </w:pPr>
-      <w:hyperlink w:anchor="_Toc242031844" w:history="1">
+      <w:hyperlink w:anchor="_Toc242137769" w:history="1">
         <w:r>
           <w:rPr>
             <w:rStyle w:val="Hyperlink"/>
@@ -1127,7 +1127,7 @@
             <w:noProof/>
             <w:webHidden/>
           </w:rPr>
-          <w:instrText xml:space="preserve"> PAGEREF _Toc242031844 \h </w:instrText>
+          <w:instrText xml:space="preserve"> PAGEREF _Toc242137769 \h </w:instrText>
         </w:r>
         <w:r>
           <w:rPr>
@@ -1147,7 +1147,7 @@
             <w:noProof/>
             <w:webHidden/>
           </w:rPr>
-          <w:t>6</w:t>
+          <w:t>7</w:t>
         </w:r>
         <w:r>
           <w:rPr>
@@ -1168,7 +1168,7 @@
           <w:szCs w:val="22"/>
         </w:rPr>
       </w:pPr>
-      <w:hyperlink w:anchor="_Toc242031845" w:history="1">
+      <w:hyperlink w:anchor="_Toc242137770" w:history="1">
         <w:r>
           <w:rPr>
             <w:rStyle w:val="Hyperlink"/>
@@ -1195,7 +1195,7 @@
             <w:noProof/>
             <w:webHidden/>
           </w:rPr>
-          <w:instrText xml:space="preserve"> PAGEREF _Toc242031845 \h </w:instrText>
+          <w:instrText xml:space="preserve"> PAGEREF _Toc242137770 \h </w:instrText>
         </w:r>
         <w:r>
           <w:rPr>
@@ -1215,7 +1215,7 @@
             <w:noProof/>
             <w:webHidden/>
           </w:rPr>
-          <w:t>6</w:t>
+          <w:t>7</w:t>
         </w:r>
         <w:r>
           <w:rPr>
@@ -1236,7 +1236,7 @@
           <w:szCs w:val="22"/>
         </w:rPr>
       </w:pPr>
-      <w:hyperlink w:anchor="_Toc242031846" w:history="1">
+      <w:hyperlink w:anchor="_Toc242137771" w:history="1">
         <w:r>
           <w:rPr>
             <w:rStyle w:val="Hyperlink"/>
@@ -1263,7 +1263,7 @@
             <w:noProof/>
             <w:webHidden/>
           </w:rPr>
-          <w:instrText xml:space="preserve"> PAGEREF _Toc242031846 \h </w:instrText>
+          <w:instrText xml:space="preserve"> PAGEREF _Toc242137771 \h </w:instrText>
         </w:r>
         <w:r>
           <w:rPr>
@@ -1283,7 +1283,7 @@
             <w:noProof/>
             <w:webHidden/>
           </w:rPr>
-          <w:t>6</w:t>
+          <w:t>7</w:t>
         </w:r>
         <w:r>
           <w:rPr>
@@ -1304,7 +1304,7 @@
           <w:szCs w:val="22"/>
         </w:rPr>
       </w:pPr>
-      <w:hyperlink w:anchor="_Toc242031847" w:history="1">
+      <w:hyperlink w:anchor="_Toc242137772" w:history="1">
         <w:r>
           <w:rPr>
             <w:rStyle w:val="Hyperlink"/>
@@ -1331,7 +1331,7 @@
             <w:noProof/>
             <w:webHidden/>
           </w:rPr>
-          <w:instrText xml:space="preserve"> PAGEREF _Toc242031847 \h </w:instrText>
+          <w:instrText xml:space="preserve"> PAGEREF _Toc242137772 \h </w:instrText>
         </w:r>
         <w:r>
           <w:rPr>
@@ -1351,7 +1351,7 @@
             <w:noProof/>
             <w:webHidden/>
           </w:rPr>
-          <w:t>6</w:t>
+          <w:t>8</w:t>
         </w:r>
         <w:r>
           <w:rPr>
@@ -1372,7 +1372,7 @@
           <w:szCs w:val="22"/>
         </w:rPr>
       </w:pPr>
-      <w:hyperlink w:anchor="_Toc242031848" w:history="1">
+      <w:hyperlink w:anchor="_Toc242137773" w:history="1">
         <w:r>
           <w:rPr>
             <w:rStyle w:val="Hyperlink"/>
@@ -1399,7 +1399,7 @@
             <w:noProof/>
             <w:webHidden/>
           </w:rPr>
-          <w:instrText xml:space="preserve"> PAGEREF _Toc242031848 \h </w:instrText>
+          <w:instrText xml:space="preserve"> PAGEREF _Toc242137773 \h </w:instrText>
         </w:r>
         <w:r>
           <w:rPr>
@@ -1419,7 +1419,7 @@
             <w:noProof/>
             <w:webHidden/>
           </w:rPr>
-          <w:t>7</w:t>
+          <w:t>8</w:t>
         </w:r>
         <w:r>
           <w:rPr>
@@ -1441,7 +1441,7 @@
           <w:szCs w:val="22"/>
         </w:rPr>
       </w:pPr>
-      <w:hyperlink w:anchor="_Toc242031849" w:history="1">
+      <w:hyperlink w:anchor="_Toc242137774" w:history="1">
         <w:r>
           <w:rPr>
             <w:rStyle w:val="Hyperlink"/>
@@ -1468,7 +1468,7 @@
             <w:noProof/>
             <w:webHidden/>
           </w:rPr>
-          <w:instrText xml:space="preserve"> PAGEREF _Toc242031849 \h </w:instrText>
+          <w:instrText xml:space="preserve"> PAGEREF _Toc242137774 \h </w:instrText>
         </w:r>
         <w:r>
           <w:rPr>
@@ -1488,7 +1488,7 @@
             <w:noProof/>
             <w:webHidden/>
           </w:rPr>
-          <w:t>7</w:t>
+          <w:t>8</w:t>
         </w:r>
         <w:r>
           <w:rPr>
@@ -1509,7 +1509,7 @@
           <w:szCs w:val="22"/>
         </w:rPr>
       </w:pPr>
-      <w:hyperlink w:anchor="_Toc242031850" w:history="1">
+      <w:hyperlink w:anchor="_Toc242137775" w:history="1">
         <w:r>
           <w:rPr>
             <w:rStyle w:val="Hyperlink"/>
@@ -1536,7 +1536,7 @@
             <w:noProof/>
             <w:webHidden/>
           </w:rPr>
-          <w:instrText xml:space="preserve"> PAGEREF _Toc242031850 \h </w:instrText>
+          <w:instrText xml:space="preserve"> PAGEREF _Toc242137775 \h </w:instrText>
         </w:r>
         <w:r>
           <w:rPr>
@@ -1556,7 +1556,7 @@
             <w:noProof/>
             <w:webHidden/>
           </w:rPr>
-          <w:t>7</w:t>
+          <w:t>9</w:t>
         </w:r>
         <w:r>
           <w:rPr>
@@ -1577,7 +1577,7 @@
           <w:szCs w:val="22"/>
         </w:rPr>
       </w:pPr>
-      <w:hyperlink w:anchor="_Toc242031851" w:history="1">
+      <w:hyperlink w:anchor="_Toc242137776" w:history="1">
         <w:r>
           <w:rPr>
             <w:rStyle w:val="Hyperlink"/>
@@ -1604,7 +1604,7 @@
             <w:noProof/>
             <w:webHidden/>
           </w:rPr>
-          <w:instrText xml:space="preserve"> PAGEREF _Toc242031851 \h </w:instrText>
+          <w:instrText xml:space="preserve"> PAGEREF _Toc242137776 \h </w:instrText>
         </w:r>
         <w:r>
           <w:rPr>
@@ -1624,7 +1624,7 @@
             <w:noProof/>
             <w:webHidden/>
           </w:rPr>
-          <w:t>7</w:t>
+          <w:t>9</w:t>
         </w:r>
         <w:r>
           <w:rPr>
@@ -1646,7 +1646,7 @@
           <w:szCs w:val="22"/>
         </w:rPr>
       </w:pPr>
-      <w:hyperlink w:anchor="_Toc242031852" w:history="1">
+      <w:hyperlink w:anchor="_Toc242137777" w:history="1">
         <w:r>
           <w:rPr>
             <w:rStyle w:val="Hyperlink"/>
@@ -1673,7 +1673,7 @@
             <w:noProof/>
             <w:webHidden/>
           </w:rPr>
-          <w:instrText xml:space="preserve"> PAGEREF _Toc242031852 \h </w:instrText>
+          <w:instrText xml:space="preserve"> PAGEREF _Toc242137777 \h </w:instrText>
         </w:r>
         <w:r>
           <w:rPr>
@@ -1693,7 +1693,7 @@
             <w:noProof/>
             <w:webHidden/>
           </w:rPr>
-          <w:t>7</w:t>
+          <w:t>9</w:t>
         </w:r>
         <w:r>
           <w:rPr>
@@ -1715,7 +1715,7 @@
           <w:szCs w:val="22"/>
         </w:rPr>
       </w:pPr>
-      <w:hyperlink w:anchor="_Toc242031853" w:history="1">
+      <w:hyperlink w:anchor="_Toc242137778" w:history="1">
         <w:r>
           <w:rPr>
             <w:rStyle w:val="Hyperlink"/>
@@ -1742,7 +1742,7 @@
             <w:noProof/>
             <w:webHidden/>
           </w:rPr>
-          <w:instrText xml:space="preserve"> PAGEREF _Toc242031853 \h </w:instrText>
+          <w:instrText xml:space="preserve"> PAGEREF _Toc242137778 \h </w:instrText>
         </w:r>
         <w:r>
           <w:rPr>
@@ -1762,7 +1762,7 @@
             <w:noProof/>
             <w:webHidden/>
           </w:rPr>
-          <w:t>8</w:t>
+          <w:t>9</w:t>
         </w:r>
         <w:r>
           <w:rPr>
@@ -1783,7 +1783,7 @@
           <w:szCs w:val="22"/>
         </w:rPr>
       </w:pPr>
-      <w:hyperlink w:anchor="_Toc242031854" w:history="1">
+      <w:hyperlink w:anchor="_Toc242137779" w:history="1">
         <w:r>
           <w:rPr>
             <w:rStyle w:val="Hyperlink"/>
@@ -1810,7 +1810,7 @@
             <w:noProof/>
             <w:webHidden/>
           </w:rPr>
-          <w:instrText xml:space="preserve"> PAGEREF _Toc242031854 \h </w:instrText>
+          <w:instrText xml:space="preserve"> PAGEREF _Toc242137779 \h </w:instrText>
         </w:r>
         <w:r>
           <w:rPr>
@@ -1830,7 +1830,7 @@
             <w:noProof/>
             <w:webHidden/>
           </w:rPr>
-          <w:t>8</w:t>
+          <w:t>9</w:t>
         </w:r>
         <w:r>
           <w:rPr>
@@ -1851,7 +1851,7 @@
           <w:szCs w:val="22"/>
         </w:rPr>
       </w:pPr>
-      <w:hyperlink w:anchor="_Toc242031855" w:history="1">
+      <w:hyperlink w:anchor="_Toc242137780" w:history="1">
         <w:r>
           <w:rPr>
             <w:rStyle w:val="Hyperlink"/>
@@ -1878,7 +1878,7 @@
             <w:noProof/>
             <w:webHidden/>
           </w:rPr>
-          <w:instrText xml:space="preserve"> PAGEREF _Toc242031855 \h </w:instrText>
+          <w:instrText xml:space="preserve"> PAGEREF _Toc242137780 \h </w:instrText>
         </w:r>
         <w:r>
           <w:rPr>
@@ -1898,7 +1898,7 @@
             <w:noProof/>
             <w:webHidden/>
           </w:rPr>
-          <w:t>8</w:t>
+          <w:t>10</w:t>
         </w:r>
         <w:r>
           <w:rPr>
@@ -1920,7 +1920,7 @@
           <w:szCs w:val="22"/>
         </w:rPr>
       </w:pPr>
-      <w:hyperlink w:anchor="_Toc242031856" w:history="1">
+      <w:hyperlink w:anchor="_Toc242137781" w:history="1">
         <w:r>
           <w:rPr>
             <w:rStyle w:val="Hyperlink"/>
@@ -1947,7 +1947,7 @@
             <w:noProof/>
             <w:webHidden/>
           </w:rPr>
-          <w:instrText xml:space="preserve"> PAGEREF _Toc242031856 \h </w:instrText>
+          <w:instrText xml:space="preserve"> PAGEREF _Toc242137781 \h </w:instrText>
         </w:r>
         <w:r>
           <w:rPr>
@@ -1967,7 +1967,7 @@
             <w:noProof/>
             <w:webHidden/>
           </w:rPr>
-          <w:t>8</w:t>
+          <w:t>10</w:t>
         </w:r>
         <w:r>
           <w:rPr>
@@ -1989,7 +1989,7 @@
           <w:szCs w:val="22"/>
         </w:rPr>
       </w:pPr>
-      <w:hyperlink w:anchor="_Toc242031857" w:history="1">
+      <w:hyperlink w:anchor="_Toc242137782" w:history="1">
         <w:r>
           <w:rPr>
             <w:rStyle w:val="Hyperlink"/>
@@ -2016,7 +2016,7 @@
             <w:noProof/>
             <w:webHidden/>
           </w:rPr>
-          <w:instrText xml:space="preserve"> PAGEREF _Toc242031857 \h </w:instrText>
+          <w:instrText xml:space="preserve"> PAGEREF _Toc242137782 \h </w:instrText>
         </w:r>
         <w:r>
           <w:rPr>
@@ -2036,7 +2036,7 @@
             <w:noProof/>
             <w:webHidden/>
           </w:rPr>
-          <w:t>8</w:t>
+          <w:t>10</w:t>
         </w:r>
         <w:r>
           <w:rPr>
@@ -2058,7 +2058,7 @@
           <w:szCs w:val="22"/>
         </w:rPr>
       </w:pPr>
-      <w:hyperlink w:anchor="_Toc242031858" w:history="1">
+      <w:hyperlink w:anchor="_Toc242137783" w:history="1">
         <w:r>
           <w:rPr>
             <w:rStyle w:val="Hyperlink"/>
@@ -2085,7 +2085,7 @@
             <w:noProof/>
             <w:webHidden/>
           </w:rPr>
-          <w:instrText xml:space="preserve"> PAGEREF _Toc242031858 \h </w:instrText>
+          <w:instrText xml:space="preserve"> PAGEREF _Toc242137783 \h </w:instrText>
         </w:r>
         <w:r>
           <w:rPr>
@@ -2105,7 +2105,7 @@
             <w:noProof/>
             <w:webHidden/>
           </w:rPr>
-          <w:t>9</w:t>
+          <w:t>10</w:t>
         </w:r>
         <w:r>
           <w:rPr>
@@ -2127,7 +2127,7 @@
           <w:szCs w:val="22"/>
         </w:rPr>
       </w:pPr>
-      <w:hyperlink w:anchor="_Toc242031859" w:history="1">
+      <w:hyperlink w:anchor="_Toc242137784" w:history="1">
         <w:r>
           <w:rPr>
             <w:rStyle w:val="Hyperlink"/>
@@ -2154,7 +2154,7 @@
             <w:noProof/>
             <w:webHidden/>
           </w:rPr>
-          <w:instrText xml:space="preserve"> PAGEREF _Toc242031859 \h </w:instrText>
+          <w:instrText xml:space="preserve"> PAGEREF _Toc242137784 \h </w:instrText>
         </w:r>
         <w:r>
           <w:rPr>
@@ -2174,7 +2174,7 @@
             <w:noProof/>
             <w:webHidden/>
           </w:rPr>
-          <w:t>9</w:t>
+          <w:t>11</w:t>
         </w:r>
         <w:r>
           <w:rPr>
@@ -2196,7 +2196,7 @@
           <w:szCs w:val="22"/>
         </w:rPr>
       </w:pPr>
-      <w:hyperlink w:anchor="_Toc242031860" w:history="1">
+      <w:hyperlink w:anchor="_Toc242137785" w:history="1">
         <w:r>
           <w:rPr>
             <w:rStyle w:val="Hyperlink"/>
@@ -2223,7 +2223,7 @@
             <w:noProof/>
             <w:webHidden/>
           </w:rPr>
-          <w:instrText xml:space="preserve"> PAGEREF _Toc242031860 \h </w:instrText>
+          <w:instrText xml:space="preserve"> PAGEREF _Toc242137785 \h </w:instrText>
         </w:r>
         <w:r>
           <w:rPr>
@@ -2243,7 +2243,7 @@
             <w:noProof/>
             <w:webHidden/>
           </w:rPr>
-          <w:t>9</w:t>
+          <w:t>11</w:t>
         </w:r>
         <w:r>
           <w:rPr>
@@ -2256,6 +2256,7 @@
     </w:p>
     <w:p>
       <w:r>
+        <w:lastRenderedPageBreak/>
         <w:fldChar w:fldCharType="end"/>
       </w:r>
     </w:p>
@@ -2268,7 +2269,7 @@
       <w:pPr>
         <w:pStyle w:val="berschrift1"/>
       </w:pPr>
-      <w:bookmarkStart w:id="0" w:name="_Toc242031829"/>
+      <w:bookmarkStart w:id="0" w:name="_Toc242137754"/>
       <w:r>
         <w:lastRenderedPageBreak/>
         <w:t>1 Überblick</w:t>
@@ -2794,11 +2795,76 @@
     </w:p>
     <w:p>
       <w:pPr>
+        <w:pStyle w:val="Figure"/>
+      </w:pPr>
+      <w:r>
+        <w:rPr>
+          <w:noProof/>
+        </w:rPr>
+        <w:drawing>
+          <wp:inline distT="0" distB="0" distL="0" distR="0" wp14:anchorId="3C74A7E4" wp14:editId="3D8AA3F3">
+            <wp:extent cx="5580000" cy="3118269"/>
+            <wp:effectExtent l="0" t="0" r="0" b="0"/>
+            <wp:docPr id="1" name="Grafik 1"/>
+            <wp:cNvGraphicFramePr>
+              <a:graphicFrameLocks xmlns:a="http://schemas.openxmlformats.org/drawingml/2006/main" noChangeAspect="1"/>
+            </wp:cNvGraphicFramePr>
+            <a:graphic xmlns:a="http://schemas.openxmlformats.org/drawingml/2006/main">
+              <a:graphicData uri="http://schemas.openxmlformats.org/drawingml/2006/picture">
+                <pic:pic xmlns:pic="http://schemas.openxmlformats.org/drawingml/2006/picture">
+                  <pic:nvPicPr>
+                    <pic:cNvPr id="1" name=""/>
+                    <pic:cNvPicPr/>
+                  </pic:nvPicPr>
+                  <pic:blipFill>
+                    <a:blip r:embed="rId7">
+                      <a:extLst>
+                        <a:ext uri="{28A0092B-C50C-407E-A947-70E740481C1C}">
+                          <a14:useLocalDpi xmlns:a14="http://schemas.microsoft.com/office/drawing/2010/main" val="0"/>
+                        </a:ext>
+                        <a:ext uri="{96DAC541-7B7A-43D3-8B79-37D633B846F1}">
+                          <asvg:svgBlip xmlns:asvg="http://schemas.microsoft.com/office/drawing/2016/SVG/main" r:embed="rId8"/>
+                        </a:ext>
+                      </a:extLst>
+                    </a:blip>
+                    <a:stretch>
+                      <a:fillRect/>
+                    </a:stretch>
+                  </pic:blipFill>
+                  <pic:spPr>
+                    <a:xfrm>
+                      <a:off x="0" y="0"/>
+                      <a:ext cx="5580000" cy="3118269"/>
+                    </a:xfrm>
+                    <a:prstGeom prst="rect">
+                      <a:avLst/>
+                    </a:prstGeom>
+                  </pic:spPr>
+                </pic:pic>
+              </a:graphicData>
+            </a:graphic>
+          </wp:inline>
+        </w:drawing>
+      </w:r>
+    </w:p>
+    <w:p>
+      <w:pPr>
+        <w:pStyle w:val="Beschriftung"/>
+      </w:pPr>
+      <w:r>
+        <w:t>Abbildung 1: Datenfluss von den Sensoren durch das Error-State-EKF zum EFIS</w:t>
+      </w:r>
+    </w:p>
+    <w:p>
+      <w:pPr>
         <w:pStyle w:val="berschrift1"/>
       </w:pPr>
-      <w:bookmarkStart w:id="1" w:name="_Toc242031830"/>
-      <w:r>
-        <w:t>2 Koordinatensysteme und Konventionen</w:t>
+      <w:bookmarkStart w:id="1" w:name="_Toc242137755"/>
+      <w:r>
+        <w:t xml:space="preserve">2 </w:t>
+      </w:r>
+      <w:r>
+        <w:t>Koordinatensysteme und Konventionen</w:t>
       </w:r>
       <w:bookmarkEnd w:id="1"/>
     </w:p>
@@ -2813,10 +2879,7 @@
         <w:t>Navigationssystem n:</w:t>
       </w:r>
       <w:r>
-        <w:t xml:space="preserve"> lokales NED (Nord, Ost, Unte</w:t>
-      </w:r>
-      <w:r>
-        <w:t>n), Ursprung beim ersten GNSS-Fix, flache Erde; ab 20 km Abstand wird der Ursprung nachgeführt. Erddrehung wird vernachlässigt (15 °/h ≪ MEMS-Bias).</w:t>
+        <w:t xml:space="preserve"> lokales NED (Nord, Ost, Unten), Ursprung beim ersten GNSS-Fix, flache Erde; ab 20 km Abstand wird der Ursprung nachgeführt. Erddrehung wird vernachlässigt (15 °/h ≪ MEMS-Bias).</w:t>
       </w:r>
     </w:p>
     <w:p>
@@ -2896,7 +2959,10 @@
         <w:t>Lage:</w:t>
       </w:r>
       <w:r>
-        <w:t xml:space="preserve"> Quaternion q, dreht Körper- in Navigationsvektoren: v</w:t>
+        <w:t xml:space="preserve"> Quaternion q, dreh</w:t>
+      </w:r>
+      <w:r>
+        <w:t>t Körper- in Navigationsvektoren: v</w:t>
       </w:r>
       <w:r>
         <w:rPr>
@@ -2914,10 +2980,7 @@
         <w:t>b</w:t>
       </w:r>
       <w:r>
-        <w:t>. Euler-Winkel nach ZYX (Gieren ψ, Nicken θ</w:t>
-      </w:r>
-      <w:r>
-        <w:t>, Rollen φ).</w:t>
+        <w:t>. Euler-Winkel nach ZYX (Gieren ψ, Nicken θ, Rollen φ).</w:t>
       </w:r>
     </w:p>
     <w:p>
@@ -2928,6 +2991,7 @@
         <w:rPr>
           <w:b/>
         </w:rPr>
+        <w:lastRenderedPageBreak/>
         <w:t>Spezifische Kraft:</w:t>
       </w:r>
       <w:r>
@@ -2954,7 +3018,10 @@
         <w:t>Kurse:</w:t>
       </w:r>
       <w:r>
-        <w:t xml:space="preserve"> ψ ist der geografische Steuerkurs im Filter; gesendet wird der missweisende ψ</w:t>
+        <w:t xml:space="preserve"> ψ ist der geografische Steu</w:t>
+      </w:r>
+      <w:r>
+        <w:t>erkurs im Filter; gesendet wird der missweisende ψ</w:t>
       </w:r>
       <w:r>
         <w:rPr>
@@ -2963,10 +3030,7 @@
         <w:t>m</w:t>
       </w:r>
       <w:r>
-        <w:t xml:space="preserve"> = ψ − D (D: Missweisung, Ost positiv)</w:t>
-      </w:r>
-      <w:r>
-        <w:t>.</w:t>
+        <w:t xml:space="preserve"> = ψ − D (D: Missweisung, Ost positiv).</w:t>
       </w:r>
     </w:p>
     <w:p>
@@ -2996,7 +3060,7 @@
       <w:pPr>
         <w:pStyle w:val="berschrift1"/>
       </w:pPr>
-      <w:bookmarkStart w:id="2" w:name="_Toc242031831"/>
+      <w:bookmarkStart w:id="2" w:name="_Toc242137756"/>
       <w:r>
         <w:t>3 Zustandsvektor</w:t>
       </w:r>
@@ -3006,9 +3070,12 @@
       <w:pPr>
         <w:pStyle w:val="berschrift2"/>
       </w:pPr>
-      <w:bookmarkStart w:id="3" w:name="_Toc242031832"/>
-      <w:r>
-        <w:t>3.1 Nominalzustand und Fehlerzustand</w:t>
+      <w:bookmarkStart w:id="3" w:name="_Toc242137757"/>
+      <w:r>
+        <w:t>3.1 Nomi</w:t>
+      </w:r>
+      <w:r>
+        <w:t>nalzustand und Fehlerzustand</w:t>
       </w:r>
       <w:bookmarkEnd w:id="3"/>
     </w:p>
@@ -3544,7 +3611,6 @@
               <w:pStyle w:val="TableText"/>
             </w:pPr>
             <w:r>
-              <w:lastRenderedPageBreak/>
               <w:t>b</w:t>
             </w:r>
             <w:r>
@@ -3835,7 +3901,7 @@
       <w:pPr>
         <w:pStyle w:val="berschrift2"/>
       </w:pPr>
-      <w:bookmarkStart w:id="4" w:name="_Toc242031833"/>
+      <w:bookmarkStart w:id="4" w:name="_Toc242137758"/>
       <w:r>
         <w:t>3.2 Weitere geschätzte Größen (außerhalb des ESKF)</w:t>
       </w:r>
@@ -4183,7 +4249,7 @@
       <w:pPr>
         <w:pStyle w:val="berschrift1"/>
       </w:pPr>
-      <w:bookmarkStart w:id="5" w:name="_Toc242031834"/>
+      <w:bookmarkStart w:id="5" w:name="_Toc242137759"/>
       <w:r>
         <w:t>4 Prädiktion (Strapdown-Rechnung)</w:t>
       </w:r>
@@ -4193,7 +4259,7 @@
       <w:pPr>
         <w:pStyle w:val="berschrift2"/>
       </w:pPr>
-      <w:bookmarkStart w:id="6" w:name="_Toc242031835"/>
+      <w:bookmarkStart w:id="6" w:name="_Toc242137760"/>
       <w:r>
         <w:t>4.1 Nominalzustand</w:t>
       </w:r>
@@ -4201,10 +4267,7 @@
     </w:p>
     <w:p>
       <w:r>
-        <w:t xml:space="preserve">Mit den gemessenen Werten ω̃ (Drehrate) und f̃ (spezifische Kraft), bereits durch T ins Körpersystem </w:t>
-      </w:r>
-      <w:r>
-        <w:t>gedreht:</w:t>
+        <w:t>Mit den gemessenen Werten ω̃ (Drehrate) und f̃ (spezifische Kraft), bereits durch T ins Körpersystem gedreht:</w:t>
       </w:r>
     </w:p>
     <w:p>
@@ -4449,8 +4512,9 @@
       <w:pPr>
         <w:pStyle w:val="berschrift2"/>
       </w:pPr>
-      <w:bookmarkStart w:id="7" w:name="_Toc242031836"/>
-      <w:r>
+      <w:bookmarkStart w:id="7" w:name="_Toc242137761"/>
+      <w:r>
+        <w:lastRenderedPageBreak/>
         <w:t>4.2 Fehlerdynamik und Kovarianz</w:t>
       </w:r>
       <w:bookmarkEnd w:id="7"/>
@@ -4707,10 +4771,7 @@
     </w:p>
     <w:p>
       <w:r>
-        <w:t>Diskr</w:t>
-      </w:r>
-      <w:r>
-        <w:t>etisierung erster Ordnung F = I + A·Δt und Propagation</w:t>
+        <w:t>Diskretisierung erster Ordnung F = I + A·Δt und Propagation</w:t>
       </w:r>
     </w:p>
     <w:p>
@@ -5258,167 +5319,232 @@
     </w:p>
     <w:p>
       <w:r>
+        <w:t>Die Werte sind gegenüber dem Datenblatt bewusst pessimistisch (Vibration). Die Varianz der horizontalen Position wird auf (10 km)² begrenzt, damit sie ohne GNSS nicht unbegrenzt wächst.</w:t>
+      </w:r>
+    </w:p>
+    <w:p>
+      <w:pPr>
+        <w:pStyle w:val="berschrift1"/>
+      </w:pPr>
+      <w:bookmarkStart w:id="8" w:name="_Toc242137762"/>
+      <w:r>
+        <w:t>5 Messupdates</w:t>
+      </w:r>
+      <w:bookmarkEnd w:id="8"/>
+    </w:p>
+    <w:p>
+      <w:pPr>
+        <w:pStyle w:val="berschrift2"/>
+      </w:pPr>
+      <w:bookmarkStart w:id="9" w:name="_Toc242137763"/>
+      <w:r>
+        <w:t>5.1 Skalares Update</w:t>
+      </w:r>
+      <w:bookmarkEnd w:id="9"/>
+    </w:p>
+    <w:p>
+      <w:r>
+        <w:t>Alle Messungen werden einzeln (skala</w:t>
+      </w:r>
+      <w:r>
+        <w:t>r) verarbeitet – es ist keine Matrixinversion nötig. Für eine Messung z mit Modell h(x), Jacobi-Zeile H und Varianz R:</w:t>
+      </w:r>
+    </w:p>
+    <w:p>
+      <w:pPr>
+        <w:pStyle w:val="Equation"/>
+      </w:pPr>
+      <w:r>
+        <w:rPr>
+          <w:rFonts w:ascii="Cambria Math" w:hAnsi="Cambria Math" w:cs="Cambria Math"/>
+        </w:rPr>
+        <w:t>ν = z − h(x̂),    S = H·P·H</w:t>
+      </w:r>
+      <w:r>
+        <w:rPr>
+          <w:rFonts w:ascii="Cambria Math" w:hAnsi="Cambria Math" w:cs="Cambria Math"/>
+          <w:vertAlign w:val="superscript"/>
+        </w:rPr>
+        <w:t>T</w:t>
+      </w:r>
+      <w:r>
+        <w:rPr>
+          <w:rFonts w:ascii="Cambria Math" w:hAnsi="Cambria Math" w:cs="Cambria Math"/>
+        </w:rPr>
+        <w:t xml:space="preserve"> + R,    K = P·H</w:t>
+      </w:r>
+      <w:r>
+        <w:rPr>
+          <w:rFonts w:ascii="Cambria Math" w:hAnsi="Cambria Math" w:cs="Cambria Math"/>
+          <w:vertAlign w:val="superscript"/>
+        </w:rPr>
+        <w:t>T</w:t>
+      </w:r>
+      <w:r>
+        <w:rPr>
+          <w:rFonts w:ascii="Cambria Math" w:hAnsi="Cambria Math" w:cs="Cambria Math"/>
+        </w:rPr>
+        <w:t xml:space="preserve"> / S</w:t>
+      </w:r>
+    </w:p>
+    <w:p>
+      <w:pPr>
+        <w:pStyle w:val="Equation"/>
+      </w:pPr>
+      <w:r>
+        <w:rPr>
+          <w:rFonts w:ascii="Cambria Math" w:hAnsi="Cambria Math" w:cs="Cambria Math"/>
+        </w:rPr>
+        <w:t>δx = K·ν,    P⁺ = P − (P·H</w:t>
+      </w:r>
+      <w:r>
+        <w:rPr>
+          <w:rFonts w:ascii="Cambria Math" w:hAnsi="Cambria Math" w:cs="Cambria Math"/>
+          <w:vertAlign w:val="superscript"/>
+        </w:rPr>
+        <w:t>T</w:t>
+      </w:r>
+      <w:r>
+        <w:rPr>
+          <w:rFonts w:ascii="Cambria Math" w:hAnsi="Cambria Math" w:cs="Cambria Math"/>
+        </w:rPr>
+        <w:t>)(P·H</w:t>
+      </w:r>
+      <w:r>
+        <w:rPr>
+          <w:rFonts w:ascii="Cambria Math" w:hAnsi="Cambria Math" w:cs="Cambria Math"/>
+          <w:vertAlign w:val="superscript"/>
+        </w:rPr>
+        <w:t>T</w:t>
+      </w:r>
+      <w:r>
+        <w:rPr>
+          <w:rFonts w:ascii="Cambria Math" w:hAnsi="Cambria Math" w:cs="Cambria Math"/>
+        </w:rPr>
+        <w:t>)</w:t>
+      </w:r>
+      <w:r>
+        <w:rPr>
+          <w:rFonts w:ascii="Cambria Math" w:hAnsi="Cambria Math" w:cs="Cambria Math"/>
+          <w:vertAlign w:val="superscript"/>
+        </w:rPr>
+        <w:t>T</w:t>
+      </w:r>
+      <w:r>
+        <w:rPr>
+          <w:rFonts w:ascii="Cambria Math" w:hAnsi="Cambria Math" w:cs="Cambria Math"/>
+        </w:rPr>
+        <w:t xml:space="preserve"> / S</w:t>
+      </w:r>
+    </w:p>
+    <w:p>
+      <w:r>
+        <w:rPr>
+          <w:b/>
+        </w:rPr>
+        <w:t>Plausibilitätstor:</w:t>
+      </w:r>
+      <w:r>
+        <w:t xml:space="preserve"> Das Update wird verworfen, w</w:t>
+      </w:r>
+      <w:r>
+        <w:t>enn ν²/S &gt; γ (normierte Innovation; γ = 25 entspricht 5σ). Danach wird δx in den Nominalzustand übernommen (q ← q ⊗ Exp(δθ), Biase begrenzt) und P symmetrisiert.</w:t>
+      </w:r>
+    </w:p>
+    <w:p>
+      <w:r>
+        <w:rPr>
+          <w:b/>
+        </w:rPr>
+        <w:t>Schmidt-Update („consider states“):</w:t>
+      </w:r>
+      <w:r>
+        <w:t xml:space="preserve"> Bei näherungsweisen Pseudo-Messungen werden Biase und Miss</w:t>
+      </w:r>
+      <w:r>
+        <w:t>weisung nicht korrigiert (K</w:t>
+      </w:r>
+      <w:r>
+        <w:rPr>
+          <w:vertAlign w:val="subscript"/>
+        </w:rPr>
+        <w:t>i</w:t>
+      </w:r>
+      <w:r>
+        <w:t xml:space="preserve"> = 0) und ihre Kovarianz bleibt unverändert; die übrigen Zustände berücksichtigen deren Unsicherheit aber weiterhin. So lernt das Filter Modellfehler (Wind, Anstellwinkel) nicht als Sensor-Bias.</w:t>
+      </w:r>
+    </w:p>
+    <w:p>
+      <w:pPr>
+        <w:pStyle w:val="Figure"/>
+      </w:pPr>
+      <w:r>
+        <w:rPr>
+          <w:noProof/>
+        </w:rPr>
         <w:lastRenderedPageBreak/>
-        <w:t>Die Werte sind gegenüber dem Datenblatt bewusst pessimistisch (Vibration). Die Varianz der horizontalen Position wird auf (10 km)² begrenzt, damit sie ohne GNSS nicht unbegrenzt wächst.</w:t>
-      </w:r>
-    </w:p>
-    <w:p>
-      <w:pPr>
-        <w:pStyle w:val="berschrift1"/>
-      </w:pPr>
-      <w:bookmarkStart w:id="8" w:name="_Toc242031837"/>
-      <w:r>
-        <w:t>5 Messupdates</w:t>
-      </w:r>
-      <w:bookmarkEnd w:id="8"/>
+        <w:drawing>
+          <wp:inline distT="0" distB="0" distL="0" distR="0" wp14:anchorId="19140FF2" wp14:editId="4DBDBA2C">
+            <wp:extent cx="4680000" cy="4301249"/>
+            <wp:effectExtent l="0" t="0" r="0" b="0"/>
+            <wp:docPr id="2" name="Grafik 2"/>
+            <wp:cNvGraphicFramePr>
+              <a:graphicFrameLocks xmlns:a="http://schemas.openxmlformats.org/drawingml/2006/main" noChangeAspect="1"/>
+            </wp:cNvGraphicFramePr>
+            <a:graphic xmlns:a="http://schemas.openxmlformats.org/drawingml/2006/main">
+              <a:graphicData uri="http://schemas.openxmlformats.org/drawingml/2006/picture">
+                <pic:pic xmlns:pic="http://schemas.openxmlformats.org/drawingml/2006/picture">
+                  <pic:nvPicPr>
+                    <pic:cNvPr id="2" name=""/>
+                    <pic:cNvPicPr/>
+                  </pic:nvPicPr>
+                  <pic:blipFill>
+                    <a:blip r:embed="rId9">
+                      <a:extLst>
+                        <a:ext uri="{28A0092B-C50C-407E-A947-70E740481C1C}">
+                          <a14:useLocalDpi xmlns:a14="http://schemas.microsoft.com/office/drawing/2010/main" val="0"/>
+                        </a:ext>
+                        <a:ext uri="{96DAC541-7B7A-43D3-8B79-37D633B846F1}">
+                          <asvg:svgBlip xmlns:asvg="http://schemas.microsoft.com/office/drawing/2016/SVG/main" r:embed="rId10"/>
+                        </a:ext>
+                      </a:extLst>
+                    </a:blip>
+                    <a:stretch>
+                      <a:fillRect/>
+                    </a:stretch>
+                  </pic:blipFill>
+                  <pic:spPr>
+                    <a:xfrm>
+                      <a:off x="0" y="0"/>
+                      <a:ext cx="4680000" cy="4301249"/>
+                    </a:xfrm>
+                    <a:prstGeom prst="rect">
+                      <a:avLst/>
+                    </a:prstGeom>
+                  </pic:spPr>
+                </pic:pic>
+              </a:graphicData>
+            </a:graphic>
+          </wp:inline>
+        </w:drawing>
+      </w:r>
+    </w:p>
+    <w:p>
+      <w:pPr>
+        <w:pStyle w:val="Beschriftung"/>
+      </w:pPr>
+      <w:r>
+        <w:t>Abbildung 2: Ablauf eine</w:t>
+      </w:r>
+      <w:r>
+        <w:t>s Messupdates (gilt für jede skalare Messung)</w:t>
+      </w:r>
     </w:p>
     <w:p>
       <w:pPr>
         <w:pStyle w:val="berschrift2"/>
       </w:pPr>
-      <w:bookmarkStart w:id="9" w:name="_Toc242031838"/>
-      <w:r>
-        <w:t>5.1 Skalares Update</w:t>
-      </w:r>
-      <w:bookmarkEnd w:id="9"/>
-    </w:p>
-    <w:p>
-      <w:r>
-        <w:t>Alle Messungen werden einzeln (skala</w:t>
-      </w:r>
-      <w:r>
-        <w:t>r) verarbeitet – es ist keine Matrixinversion nötig. Für eine Messung z mit Modell h(x), Jacobi-Zeile H und Varianz R:</w:t>
-      </w:r>
-    </w:p>
-    <w:p>
-      <w:pPr>
-        <w:pStyle w:val="Equation"/>
-      </w:pPr>
-      <w:r>
-        <w:rPr>
-          <w:rFonts w:ascii="Cambria Math" w:hAnsi="Cambria Math" w:cs="Cambria Math"/>
-        </w:rPr>
-        <w:t>ν = z − h(x̂),    S = H·P·H</w:t>
-      </w:r>
-      <w:r>
-        <w:rPr>
-          <w:rFonts w:ascii="Cambria Math" w:hAnsi="Cambria Math" w:cs="Cambria Math"/>
-          <w:vertAlign w:val="superscript"/>
-        </w:rPr>
-        <w:t>T</w:t>
-      </w:r>
-      <w:r>
-        <w:rPr>
-          <w:rFonts w:ascii="Cambria Math" w:hAnsi="Cambria Math" w:cs="Cambria Math"/>
-        </w:rPr>
-        <w:t xml:space="preserve"> + R,    K = P·H</w:t>
-      </w:r>
-      <w:r>
-        <w:rPr>
-          <w:rFonts w:ascii="Cambria Math" w:hAnsi="Cambria Math" w:cs="Cambria Math"/>
-          <w:vertAlign w:val="superscript"/>
-        </w:rPr>
-        <w:t>T</w:t>
-      </w:r>
-      <w:r>
-        <w:rPr>
-          <w:rFonts w:ascii="Cambria Math" w:hAnsi="Cambria Math" w:cs="Cambria Math"/>
-        </w:rPr>
-        <w:t xml:space="preserve"> / S</w:t>
-      </w:r>
-    </w:p>
-    <w:p>
-      <w:pPr>
-        <w:pStyle w:val="Equation"/>
-      </w:pPr>
-      <w:r>
-        <w:rPr>
-          <w:rFonts w:ascii="Cambria Math" w:hAnsi="Cambria Math" w:cs="Cambria Math"/>
-        </w:rPr>
-        <w:t>δx = K·ν,    P⁺ = P − (P·H</w:t>
-      </w:r>
-      <w:r>
-        <w:rPr>
-          <w:rFonts w:ascii="Cambria Math" w:hAnsi="Cambria Math" w:cs="Cambria Math"/>
-          <w:vertAlign w:val="superscript"/>
-        </w:rPr>
-        <w:t>T</w:t>
-      </w:r>
-      <w:r>
-        <w:rPr>
-          <w:rFonts w:ascii="Cambria Math" w:hAnsi="Cambria Math" w:cs="Cambria Math"/>
-        </w:rPr>
-        <w:t>)(P·H</w:t>
-      </w:r>
-      <w:r>
-        <w:rPr>
-          <w:rFonts w:ascii="Cambria Math" w:hAnsi="Cambria Math" w:cs="Cambria Math"/>
-          <w:vertAlign w:val="superscript"/>
-        </w:rPr>
-        <w:t>T</w:t>
-      </w:r>
-      <w:r>
-        <w:rPr>
-          <w:rFonts w:ascii="Cambria Math" w:hAnsi="Cambria Math" w:cs="Cambria Math"/>
-        </w:rPr>
-        <w:t>)</w:t>
-      </w:r>
-      <w:r>
-        <w:rPr>
-          <w:rFonts w:ascii="Cambria Math" w:hAnsi="Cambria Math" w:cs="Cambria Math"/>
-          <w:vertAlign w:val="superscript"/>
-        </w:rPr>
-        <w:t>T</w:t>
-      </w:r>
-      <w:r>
-        <w:rPr>
-          <w:rFonts w:ascii="Cambria Math" w:hAnsi="Cambria Math" w:cs="Cambria Math"/>
-        </w:rPr>
-        <w:t xml:space="preserve"> / S</w:t>
-      </w:r>
-    </w:p>
-    <w:p>
-      <w:r>
-        <w:rPr>
-          <w:b/>
-        </w:rPr>
-        <w:t>Plausibilitätstor:</w:t>
-      </w:r>
-      <w:r>
-        <w:t xml:space="preserve"> Das Update wird verworfen, w</w:t>
-      </w:r>
-      <w:r>
-        <w:t>enn ν²/S &gt; γ (normierte Innovation; γ = 25 entspricht 5σ). Danach wird δx in den Nominalzustand übernommen (q ← q ⊗ Exp(δθ), Biase begrenzt) und P symmetrisiert.</w:t>
-      </w:r>
-    </w:p>
-    <w:p>
-      <w:r>
-        <w:rPr>
-          <w:b/>
-        </w:rPr>
-        <w:t>Schmidt-Update („consider states“):</w:t>
-      </w:r>
-      <w:r>
-        <w:t xml:space="preserve"> Bei näherungsweisen Pseudo-Messungen werden Biase und Miss</w:t>
-      </w:r>
-      <w:r>
-        <w:t>weisung nicht korrigiert (K</w:t>
-      </w:r>
-      <w:r>
-        <w:rPr>
-          <w:vertAlign w:val="subscript"/>
-        </w:rPr>
-        <w:t>i</w:t>
-      </w:r>
-      <w:r>
-        <w:t xml:space="preserve"> = 0) und ihre Kovarianz bleibt unverändert; die übrigen Zustände berücksichtigen deren Unsicherheit aber weiterhin. So lernt das Filter Modellfehler (Wind, Anstellwinkel) nicht als Sensor-Bias.</w:t>
-      </w:r>
-    </w:p>
-    <w:p>
-      <w:pPr>
-        <w:pStyle w:val="berschrift2"/>
-      </w:pPr>
-      <w:bookmarkStart w:id="10" w:name="_Toc242031839"/>
+      <w:bookmarkStart w:id="10" w:name="_Toc242137764"/>
       <w:r>
         <w:t>5.2 Messmodelle</w:t>
       </w:r>
@@ -5485,13 +5611,7 @@
               <w:rPr>
                 <w:b/>
               </w:rPr>
-              <w:t>Modell h(</w:t>
-            </w:r>
-            <w:r>
-              <w:rPr>
-                <w:b/>
-              </w:rPr>
-              <w:t>x)</w:t>
+              <w:t>Modell h(x)</w:t>
             </w:r>
           </w:p>
         </w:tc>
@@ -6227,7 +6347,7 @@
       <w:pPr>
         <w:pStyle w:val="berschrift2"/>
       </w:pPr>
-      <w:bookmarkStart w:id="11" w:name="_Toc242031840"/>
+      <w:bookmarkStart w:id="11" w:name="_Toc242137765"/>
       <w:r>
         <w:t>5.3 Kursmessung aus dem Magnetometer</w:t>
       </w:r>
@@ -6244,10 +6364,7 @@
         <w:t>b</w:t>
       </w:r>
       <w:r>
-        <w:t xml:space="preserve"> wird mit der aktuellen Lage ins Navigationssystem gedreht. Weil dabei der Filterkurs wieder herausfällt, ist das Ergebnis ein neigungskompensierter missweisender Kurs, der nur Roll und Nick</w:t>
-      </w:r>
-      <w:r>
-        <w:t xml:space="preserve"> des Filters benutzt:</w:t>
+        <w:t xml:space="preserve"> wird mit der aktuellen Lage ins Navigationssystem gedreht. Weil dabei der Filterkurs wieder herausfällt, ist das Ergebnis ein neigungskompensierter missweisender Kurs, der nur Roll und Nick des Filters benutzt:</w:t>
       </w:r>
     </w:p>
     <w:p>
@@ -6532,7 +6649,10 @@
         <w:t>z</w:t>
       </w:r>
       <w:r>
-        <w:t xml:space="preserve"> = 1, im Nickwinkel θ entsprechend 1/cos θ. Die Kursmessung beeinflusst Roll und Nick praktisch nicht – magnetische Störungen verfälschen so nur den Kurs, nicht den Horizont.</w:t>
+        <w:t xml:space="preserve"> = 1, im Nickwinkel θ entsprec</w:t>
+      </w:r>
+      <w:r>
+        <w:t>hend 1/cos θ. Die Kursmessung beeinflusst Roll und Nick praktisch nicht – magnetische Störungen verfälschen so nur den Kurs, nicht den Horizont.</w:t>
       </w:r>
     </w:p>
     <w:p>
@@ -6543,22 +6663,20 @@
         <w:t>Störungserkennung:</w:t>
       </w:r>
       <w:r>
-        <w:t xml:space="preserve"> Feldstärke und Inklination</w:t>
-      </w:r>
-      <w:r>
-        <w:t xml:space="preserve"> werden als Langzeitmittel (Tiefpass, Faktor 0,002 je Probe) geführt. Eine Messung gilt nur als plausibel, wenn |m| höchstens 12 % und die Inklination höchstens 8° vom Mittel abweichen; zusätzlich greift das χ²-Tor (γ = 16).</w:t>
+        <w:t xml:space="preserve"> Feldstärke und Inklination werden als Langzeitmittel (Tiefpass, Faktor 0,002 je Probe) gefüh</w:t>
+      </w:r>
+      <w:r>
+        <w:t>rt. Eine Messung gilt nur als plausibel, wenn |m| höchstens 12 % und die Inklination höchstens 8° vom Mittel abweichen; zusätzlich greift das χ²-Tor (γ = 16).</w:t>
       </w:r>
     </w:p>
     <w:p>
       <w:pPr>
         <w:pStyle w:val="berschrift1"/>
       </w:pPr>
-      <w:bookmarkStart w:id="12" w:name="_Toc242031841"/>
-      <w:r>
-        <w:t>6 Initialisierung und Stillstan</w:t>
-      </w:r>
-      <w:r>
-        <w:t>d</w:t>
+      <w:bookmarkStart w:id="12" w:name="_Toc242137766"/>
+      <w:r>
+        <w:lastRenderedPageBreak/>
+        <w:t>6 Initialisierung und Stillstand</w:t>
       </w:r>
       <w:bookmarkEnd w:id="12"/>
     </w:p>
@@ -6566,7 +6684,7 @@
       <w:pPr>
         <w:pStyle w:val="berschrift2"/>
       </w:pPr>
-      <w:bookmarkStart w:id="13" w:name="_Toc242031842"/>
+      <w:bookmarkStart w:id="13" w:name="_Toc242137767"/>
       <w:r>
         <w:t>6.1 Ausrichtung</w:t>
       </w:r>
@@ -6574,7 +6692,10 @@
     </w:p>
     <w:p>
       <w:r>
-        <w:t>Nach dem Einschalten (bzw. nach einer Änderung des Einbauversatzes) werden 1 s lang Beschleunigung und Drehrate gemittelt (bis 3 s, falls noch kein Magnetometerwert vorliegt):</w:t>
+        <w:t>Nach dem Einschalten (bzw. nach einer Änderung d</w:t>
+      </w:r>
+      <w:r>
+        <w:t>es Einbauversatzes) werden 1 s lang Beschleunigung und Drehrate gemittelt (bis 3 s, falls noch kein Magnetometerwert vorliegt):</w:t>
       </w:r>
     </w:p>
     <w:p>
@@ -6650,13 +6771,7 @@
         <w:rPr>
           <w:rFonts w:ascii="Cambria Math" w:hAnsi="Cambria Math" w:cs="Cambria Math"/>
         </w:rPr>
-        <w:t>²)),    ψ</w:t>
-      </w:r>
-      <w:r>
-        <w:rPr>
-          <w:rFonts w:ascii="Cambria Math" w:hAnsi="Cambria Math" w:cs="Cambria Math"/>
-        </w:rPr>
-        <w:t xml:space="preserve"> = ψ</w:t>
+        <w:t>²)),    ψ = ψ</w:t>
       </w:r>
       <w:r>
         <w:rPr>
@@ -6674,11 +6789,10 @@
     </w:p>
     <w:p>
       <w:r>
-        <w:lastRenderedPageBreak/>
-        <w:t>Stand das Gerät dabei still (max. Drehrate &lt; 0,05 rad/s, ||f̄| − g| &lt; 0,5 m/s²), wird der Mittelwert der Drehrate als Startwert des Gyro-Bias übernommen (σ = 0,1 °/s) und die Neigung mit σ = 2° initialisiert, sonst mit 15°. Die Position startet b</w:t>
-      </w:r>
-      <w:r>
-        <w:t>ei p</w:t>
+        <w:t>Stand das Gerät dabei still (max. Drehrate &lt; 0,05 rad/s,</w:t>
+      </w:r>
+      <w:r>
+        <w:t xml:space="preserve"> ||f̄| − g| &lt; 0,5 m/s²), wird der Mittelwert der Drehrate als Startwert des Gyro-Bias übernommen (σ = 0,1 °/s) und die Neigung mit σ = 2° initialisiert, sonst mit 15°. Die Position startet bei p</w:t>
       </w:r>
       <w:r>
         <w:rPr>
@@ -6694,7 +6808,7 @@
       <w:pPr>
         <w:pStyle w:val="berschrift2"/>
       </w:pPr>
-      <w:bookmarkStart w:id="14" w:name="_Toc242031843"/>
+      <w:bookmarkStart w:id="14" w:name="_Toc242137768"/>
       <w:r>
         <w:t>6.2 Stillstandserkennung und Nullgeschwindigkeit (ZUPT)</w:t>
       </w:r>
@@ -6702,27 +6816,30 @@
     </w:p>
     <w:p>
       <w:r>
-        <w:t>Aktivitätsmaße (Tiefpass, Zeitkonstante 0,5 s): Betrag der korrigierten Drehrate und Abweichung |f| − g. „Ruhig“ heißt Drehrate &lt; 0,03 rad/s und Beschleunigungsabweichung &lt; 0,3 m/s</w:t>
-      </w:r>
-      <w:r>
-        <w:t>². Zusätzlich muss die Richtung der gefilterten spezifischen Kraft auf 1° stabil bleiben: Ändert sie sich ohne Drehung, liegt Linearbeschleunigung vor (Startlauf) – das Flugzeug gilt dann als „bewegt“.</w:t>
-      </w:r>
-    </w:p>
-    <w:p>
-      <w:r>
-        <w:t xml:space="preserve">Im Stillstand wird die Körpergeschwindigkeit auf null </w:t>
-      </w:r>
-      <w:r>
-        <w:t>gestützt (R = (0,1 m/s)², alle drei Achsen), aber nur, wenn GNSS eine Geschwindigkeit &lt; 0,5 m/s meldet oder seit dem Einschalten ohne GNSS keine Bewegung erkannt wurde. So wird ein ruhiger Geradeausflug nicht als Stillstand missverstanden.</w:t>
+        <w:t>Aktivitätsmaße (Tiefpass, Zeitkonstante 0,5 s): Betrag der korrigierten Drehrate und Abweichung |f| − g. „Ruhig“ heißt Drehrate &lt; 0,03 rad/s und Beschleunigungsabweichung &lt; 0,3 m/s². Zusätzlich muss d</w:t>
+      </w:r>
+      <w:r>
+        <w:t>ie Richtung der gefilterten spezifischen Kraft auf 1° stabil bleiben: Ändert sie sich ohne Drehung, liegt Linearbeschleunigung vor (Startlauf) – das Flugzeug gilt dann als „bewegt“.</w:t>
+      </w:r>
+    </w:p>
+    <w:p>
+      <w:r>
+        <w:t>Im Stillstand wird die Körpergeschwindigkeit auf null gestützt (R = (0,1 m</w:t>
+      </w:r>
+      <w:r>
+        <w:t>/s)², alle drei Achsen), aber nur, wenn GNSS eine Geschwindigkeit &lt; 0,5 m/s meldet oder seit dem Einschalten ohne GNSS keine Bewegung erkannt wurde. So wird ein ruhiger Geradeausflug nicht als Stillstand missverstanden.</w:t>
       </w:r>
     </w:p>
     <w:p>
       <w:pPr>
         <w:pStyle w:val="berschrift1"/>
       </w:pPr>
-      <w:bookmarkStart w:id="15" w:name="_Toc242031844"/>
-      <w:r>
-        <w:t>7 GNSS-Stützung und Ausfallbehandlung</w:t>
+      <w:bookmarkStart w:id="15" w:name="_Toc242137769"/>
+      <w:r>
+        <w:t>7 GNSS-Stützung und Ausfallbehandlun</w:t>
+      </w:r>
+      <w:r>
+        <w:t>g</w:t>
       </w:r>
       <w:bookmarkEnd w:id="15"/>
     </w:p>
@@ -6730,7 +6847,7 @@
       <w:pPr>
         <w:pStyle w:val="berschrift2"/>
       </w:pPr>
-      <w:bookmarkStart w:id="16" w:name="_Toc242031845"/>
+      <w:bookmarkStart w:id="16" w:name="_Toc242137770"/>
       <w:r>
         <w:t>7.1 Gültigkeit einer GNSS-Lösung</w:t>
       </w:r>
@@ -6738,10 +6855,10 @@
     </w:p>
     <w:p>
       <w:r>
-        <w:t>Eine UBX-NAV-PVT-Lösung wird nur verwendet bei: Fix-Typ 3D (oder GNSS+DR), Flag gnssFixOK, mindestens 5 Satelliten, hAcc &lt; 15 m und sAcc &lt; 2 m/s. Lat/Lon werden über die Krümmungsradien</w:t>
-      </w:r>
-      <w:r>
-        <w:t xml:space="preserve"> des WGS84 in lokale NED-Koordinaten umgerechnet:</w:t>
+        <w:t>Eine UBX-NAV-PVT-Lösung wird nur verwendet bei: Fix-Typ 3D (oder GNSS+DR), Flag gnssFixOK, mindestens 5 Satelliten, hAcc &lt; 15 m und sAcc &lt; 2 m/s. Lat/Lon werden über die Krümmungsradien des WGS84 in lokale NED-Koordinaten</w:t>
+      </w:r>
+      <w:r>
+        <w:t xml:space="preserve"> umgerechnet:</w:t>
       </w:r>
     </w:p>
     <w:p>
@@ -6824,7 +6941,7 @@
       <w:pPr>
         <w:pStyle w:val="berschrift2"/>
       </w:pPr>
-      <w:bookmarkStart w:id="17" w:name="_Toc242031846"/>
+      <w:bookmarkStart w:id="17" w:name="_Toc242137771"/>
       <w:r>
         <w:t>7.2 Zustandsautomat</w:t>
       </w:r>
@@ -7180,9 +7297,72 @@
     </w:p>
     <w:p>
       <w:pPr>
+        <w:pStyle w:val="Figure"/>
+      </w:pPr>
+      <w:r>
+        <w:rPr>
+          <w:noProof/>
+        </w:rPr>
+        <w:lastRenderedPageBreak/>
+        <w:drawing>
+          <wp:inline distT="0" distB="0" distL="0" distR="0" wp14:anchorId="1661D1FC" wp14:editId="05961063">
+            <wp:extent cx="5040000" cy="3038747"/>
+            <wp:effectExtent l="0" t="0" r="0" b="0"/>
+            <wp:docPr id="3" name="Grafik 3"/>
+            <wp:cNvGraphicFramePr>
+              <a:graphicFrameLocks xmlns:a="http://schemas.openxmlformats.org/drawingml/2006/main" noChangeAspect="1"/>
+            </wp:cNvGraphicFramePr>
+            <a:graphic xmlns:a="http://schemas.openxmlformats.org/drawingml/2006/main">
+              <a:graphicData uri="http://schemas.openxmlformats.org/drawingml/2006/picture">
+                <pic:pic xmlns:pic="http://schemas.openxmlformats.org/drawingml/2006/picture">
+                  <pic:nvPicPr>
+                    <pic:cNvPr id="3" name=""/>
+                    <pic:cNvPicPr/>
+                  </pic:nvPicPr>
+                  <pic:blipFill>
+                    <a:blip r:embed="rId11">
+                      <a:extLst>
+                        <a:ext uri="{28A0092B-C50C-407E-A947-70E740481C1C}">
+                          <a14:useLocalDpi xmlns:a14="http://schemas.microsoft.com/office/drawing/2010/main" val="0"/>
+                        </a:ext>
+                        <a:ext uri="{96DAC541-7B7A-43D3-8B79-37D633B846F1}">
+                          <asvg:svgBlip xmlns:asvg="http://schemas.microsoft.com/office/drawing/2016/SVG/main" r:embed="rId12"/>
+                        </a:ext>
+                      </a:extLst>
+                    </a:blip>
+                    <a:stretch>
+                      <a:fillRect/>
+                    </a:stretch>
+                  </pic:blipFill>
+                  <pic:spPr>
+                    <a:xfrm>
+                      <a:off x="0" y="0"/>
+                      <a:ext cx="5040000" cy="3038747"/>
+                    </a:xfrm>
+                    <a:prstGeom prst="rect">
+                      <a:avLst/>
+                    </a:prstGeom>
+                  </pic:spPr>
+                </pic:pic>
+              </a:graphicData>
+            </a:graphic>
+          </wp:inline>
+        </w:drawing>
+      </w:r>
+    </w:p>
+    <w:p>
+      <w:pPr>
+        <w:pStyle w:val="Beschriftung"/>
+      </w:pPr>
+      <w:r>
+        <w:t>Abbildung 3: GNSS-Zustandsautomat; ein ausdrückliches „kein Fix“ des Empfängers führt sofort nach Coast</w:t>
+      </w:r>
+    </w:p>
+    <w:p>
+      <w:pPr>
         <w:pStyle w:val="berschrift2"/>
       </w:pPr>
-      <w:bookmarkStart w:id="18" w:name="_Toc242031847"/>
+      <w:bookmarkStart w:id="18" w:name="_Toc242137772"/>
       <w:r>
         <w:t>7.3 Pseudo-Messungen im GNSS-Ausfall</w:t>
       </w:r>
@@ -7190,10 +7370,10 @@
     </w:p>
     <w:p>
       <w:r>
-        <w:t>Ohne GNSS kann das Filter Zentripetalbeschleunigung im Kurvenflug nicht von der Schwerkraft trennen. Es wird daher angenommen, dass die Luf</w:t>
-      </w:r>
-      <w:r>
-        <w:t>tgeschwindigkeit in Rumpflängsachse liegt (kein Schiebewinkel, Anstellwinkel α̂). Mit dem geschätzten Wind w gilt v</w:t>
+        <w:t xml:space="preserve">Ohne GNSS kann das Filter </w:t>
+      </w:r>
+      <w:r>
+        <w:t>Zentripetalbeschleunigung im Kurvenflug nicht von der Schwerkraft trennen. Es wird daher angenommen, dass die Luftgeschwindigkeit in Rumpflängsachse liegt (kein Schiebewinkel, Anstellwinkel α̂). Mit dem geschätzten Wind w gilt v</w:t>
       </w:r>
       <w:r>
         <w:rPr>
@@ -7211,7 +7391,10 @@
         <w:t>T</w:t>
       </w:r>
       <w:r>
-        <w:t>(v − w), und mit 10 Hz werden gestützt:</w:t>
+        <w:t>(v − w), und mit 10 Hz</w:t>
+      </w:r>
+      <w:r>
+        <w:t xml:space="preserve"> werden gestützt:</w:t>
       </w:r>
     </w:p>
     <w:tbl>
@@ -7705,32 +7888,379 @@
     </w:p>
     <w:p>
       <w:r>
-        <w:t>Die Pseudo-Messungen sind Schmidt-Updates: Biase und Missweisung werden dabei nicht verändert (Kap. 5.1).</w:t>
+        <w:t>Die Pseudo-Messungen sind Schmidt-Updates: Biase und Missweisung wer</w:t>
+      </w:r>
+      <w:r>
+        <w:t>den dabei nicht verändert (Kap. 5.1).</w:t>
       </w:r>
     </w:p>
     <w:p>
       <w:pPr>
         <w:pStyle w:val="berschrift2"/>
       </w:pPr>
-      <w:bookmarkStart w:id="19" w:name="_Toc242031848"/>
+      <w:bookmarkStart w:id="19" w:name="_Toc242137773"/>
+      <w:r>
+        <w:t>7.4 Windreieck und Anstellwinkel</w:t>
+      </w:r>
+      <w:bookmarkEnd w:id="19"/>
+    </w:p>
+    <w:p>
+      <w:r>
+        <w:t>Solange GNSS gültig ist und die Grundgeschwindigkeit 15 m/s übersteigt, schätzt ein rekursiver Kleinste-Quadrate-Schätzer (RLS, Vergessensfaktor λ = 0,995 je Lösung) die horizontale Fahrt V</w:t>
+      </w:r>
+      <w:r>
+        <w:rPr>
+          <w:vertAlign w:val="subscript"/>
+        </w:rPr>
+        <w:t>a</w:t>
+      </w:r>
+      <w:r>
+        <w:t xml:space="preserve"> und den Wind:</w:t>
+      </w:r>
+    </w:p>
+    <w:p>
+      <w:pPr>
+        <w:pStyle w:val="Equation"/>
+      </w:pPr>
+      <w:r>
+        <w:rPr>
+          <w:rFonts w:ascii="Cambria Math" w:hAnsi="Cambria Math" w:cs="Cambria Math"/>
+        </w:rPr>
+        <w:t>v</w:t>
+      </w:r>
+      <w:r>
+        <w:rPr>
+          <w:rFonts w:ascii="Cambria Math" w:hAnsi="Cambria Math" w:cs="Cambria Math"/>
+          <w:vertAlign w:val="subscript"/>
+        </w:rPr>
+        <w:t>N</w:t>
+      </w:r>
+      <w:r>
+        <w:rPr>
+          <w:rFonts w:ascii="Cambria Math" w:hAnsi="Cambria Math" w:cs="Cambria Math"/>
+        </w:rPr>
+        <w:t xml:space="preserve"> = V</w:t>
+      </w:r>
+      <w:r>
+        <w:rPr>
+          <w:rFonts w:ascii="Cambria Math" w:hAnsi="Cambria Math" w:cs="Cambria Math"/>
+          <w:vertAlign w:val="subscript"/>
+        </w:rPr>
+        <w:t>a</w:t>
+      </w:r>
+      <w:r>
+        <w:rPr>
+          <w:rFonts w:ascii="Cambria Math" w:hAnsi="Cambria Math" w:cs="Cambria Math"/>
+        </w:rPr>
+        <w:t>·cos ψ + w</w:t>
+      </w:r>
+      <w:r>
+        <w:rPr>
+          <w:rFonts w:ascii="Cambria Math" w:hAnsi="Cambria Math" w:cs="Cambria Math"/>
+          <w:vertAlign w:val="subscript"/>
+        </w:rPr>
+        <w:t>N</w:t>
+      </w:r>
+      <w:r>
+        <w:rPr>
+          <w:rFonts w:ascii="Cambria Math" w:hAnsi="Cambria Math" w:cs="Cambria Math"/>
+        </w:rPr>
+        <w:t>,    v</w:t>
+      </w:r>
+      <w:r>
+        <w:rPr>
+          <w:rFonts w:ascii="Cambria Math" w:hAnsi="Cambria Math" w:cs="Cambria Math"/>
+          <w:vertAlign w:val="subscript"/>
+        </w:rPr>
+        <w:t>E</w:t>
+      </w:r>
+      <w:r>
+        <w:rPr>
+          <w:rFonts w:ascii="Cambria Math" w:hAnsi="Cambria Math" w:cs="Cambria Math"/>
+        </w:rPr>
+        <w:t xml:space="preserve"> = V</w:t>
+      </w:r>
+      <w:r>
+        <w:rPr>
+          <w:rFonts w:ascii="Cambria Math" w:hAnsi="Cambria Math" w:cs="Cambria Math"/>
+          <w:vertAlign w:val="subscript"/>
+        </w:rPr>
+        <w:t>a</w:t>
+      </w:r>
+      <w:r>
+        <w:rPr>
+          <w:rFonts w:ascii="Cambria Math" w:hAnsi="Cambria Math" w:cs="Cambria Math"/>
+        </w:rPr>
+        <w:t>·sin ψ + w</w:t>
+      </w:r>
+      <w:r>
+        <w:rPr>
+          <w:rFonts w:ascii="Cambria Math" w:hAnsi="Cambria Math" w:cs="Cambria Math"/>
+          <w:vertAlign w:val="subscript"/>
+        </w:rPr>
+        <w:t>E</w:t>
+      </w:r>
+    </w:p>
+    <w:p>
+      <w:r>
+        <w:t>Im Gerade</w:t>
+      </w:r>
+      <w:r>
+        <w:t>ausflug sind V</w:t>
+      </w:r>
+      <w:r>
+        <w:rPr>
+          <w:vertAlign w:val="subscript"/>
+        </w:rPr>
+        <w:t>a</w:t>
+      </w:r>
+      <w:r>
+        <w:t xml:space="preserve"> und Wind nicht trennbar; erst Kursänderungen machen sie beobachtbar. Die Kovarianz wird begrenzt (30 m/s bzw. 20 m/s), damit das Vergessen sie nicht unbegrenzt aufbläht. Ist der Wind bekannt, folgt der Anstellwinkel als Tiefpass α̂ ← α̂ + 0</w:t>
+      </w:r>
+      <w:r>
+        <w:t>,01·(atan2(v</w:t>
+      </w:r>
+      <w:r>
+        <w:rPr>
+          <w:vertAlign w:val="subscript"/>
+        </w:rPr>
+        <w:t>b,z</w:t>
+      </w:r>
+      <w:r>
+        <w:t>, v</w:t>
+      </w:r>
+      <w:r>
+        <w:rPr>
+          <w:vertAlign w:val="subscript"/>
+        </w:rPr>
+        <w:t>b,x</w:t>
+      </w:r>
+      <w:r>
+        <w:t>) − α̂); Startwert 2° (typischer Reiseflug).</w:t>
+      </w:r>
+    </w:p>
+    <w:p>
+      <w:pPr>
+        <w:pStyle w:val="berschrift1"/>
+      </w:pPr>
+      <w:bookmarkStart w:id="20" w:name="_Toc242137774"/>
+      <w:r>
+        <w:t>8 Magnetometer-Kalibrierung</w:t>
+      </w:r>
+      <w:bookmarkEnd w:id="20"/>
+    </w:p>
+    <w:p>
+      <w:r>
+        <w:t>Kalibriertes Feld: m</w:t>
+      </w:r>
+      <w:r>
+        <w:rPr>
+          <w:vertAlign w:val="subscript"/>
+        </w:rPr>
+        <w:t>cal</w:t>
+      </w:r>
+      <w:r>
+        <w:t xml:space="preserve"> = W·(m</w:t>
+      </w:r>
+      <w:r>
+        <w:rPr>
+          <w:vertAlign w:val="subscript"/>
+        </w:rPr>
+        <w:t>roh</w:t>
+      </w:r>
+      <w:r>
+        <w:t xml:space="preserve"> − o) mit Hart-Eisen-Offset o und symmetrischer, volumentreuer Weich-Eisen-Matrix W. Die Kalibrierung wird im Sensorsystem gerech</w:t>
+      </w:r>
+      <w:r>
+        <w:t>net und erst danach mit T ins Körpersystem gedreht.</w:t>
+      </w:r>
+    </w:p>
+    <w:p>
+      <w:pPr>
+        <w:pStyle w:val="berschrift2"/>
+      </w:pPr>
+      <w:bookmarkStart w:id="21" w:name="_Toc242137775"/>
       <w:r>
         <w:lastRenderedPageBreak/>
-        <w:t>7.4 Windreieck und Anstellwinkel</w:t>
-      </w:r>
-      <w:bookmarkEnd w:id="19"/>
-    </w:p>
-    <w:p>
-      <w:r>
-        <w:t>Solange GNSS gültig ist und die Grundgeschwindigkeit 15 m/s übersteigt, schätzt ein rekursiver Kleinste-Quadrate-Schätzer (RLS, Vergessensfaktor λ = 0,995 je Lösung) die horizontale Fahrt V</w:t>
+        <w:t>8.1 Ellipsoid-Fit mit RLS (nach Cao, Xu, Xu, Sensors 2020, 20, 535)</w:t>
+      </w:r>
+      <w:bookmarkEnd w:id="21"/>
+    </w:p>
+    <w:p>
+      <w:r>
+        <w:t>Die Messpunkte liegen auf einem Ellipsoid. Mit normierten Werten u = m/50 µT wird die Quadrik mit festem x²-Koeffizienten angesetzt – da</w:t>
+      </w:r>
+      <w:r>
+        <w:t>s bleibt stabil, auch wenn der Offset so groß wie das Feld ist:</w:t>
+      </w:r>
+    </w:p>
+    <w:p>
+      <w:pPr>
+        <w:pStyle w:val="Equation"/>
+      </w:pPr>
+      <w:r>
+        <w:rPr>
+          <w:rFonts w:ascii="Cambria Math" w:hAnsi="Cambria Math" w:cs="Cambria Math"/>
+        </w:rPr>
+        <w:t>x² + b·y² + c·z² + 2d·xy + 2e·xz + 2f·yz + 2g·x + 2h·y + 2i·z + j = 0</w:t>
+      </w:r>
+    </w:p>
+    <w:p>
+      <w:r>
+        <w:t xml:space="preserve">Die neun Parameter werden per RLS (doppelte Genauigkeit, ohne Vergessen) geschätzt. Lösung mit A = [[1, d, e], [d, b, f], </w:t>
+      </w:r>
+      <w:r>
+        <w:t>[e, f, c]] und g = (g, h, i):</w:t>
+      </w:r>
+    </w:p>
+    <w:p>
+      <w:pPr>
+        <w:pStyle w:val="Equation"/>
+      </w:pPr>
+      <w:r>
+        <w:rPr>
+          <w:rFonts w:ascii="Cambria Math" w:hAnsi="Cambria Math" w:cs="Cambria Math"/>
+        </w:rPr>
+        <w:t>o = −A</w:t>
+      </w:r>
+      <w:r>
+        <w:rPr>
+          <w:rFonts w:ascii="Cambria Math" w:hAnsi="Cambria Math" w:cs="Cambria Math"/>
+          <w:vertAlign w:val="superscript"/>
+        </w:rPr>
+        <w:t>−</w:t>
+      </w:r>
+      <w:r>
+        <w:rPr>
+          <w:rFonts w:ascii="Cambria Math" w:hAnsi="Cambria Math" w:cs="Cambria Math"/>
+          <w:vertAlign w:val="superscript"/>
+        </w:rPr>
+        <w:t>1</w:t>
+      </w:r>
+      <w:r>
+        <w:rPr>
+          <w:rFonts w:ascii="Cambria Math" w:hAnsi="Cambria Math" w:cs="Cambria Math"/>
+        </w:rPr>
+        <w:t>·g,    k = o</w:t>
+      </w:r>
+      <w:r>
+        <w:rPr>
+          <w:rFonts w:ascii="Cambria Math" w:hAnsi="Cambria Math" w:cs="Cambria Math"/>
+          <w:vertAlign w:val="superscript"/>
+        </w:rPr>
+        <w:t>T</w:t>
+      </w:r>
+      <w:r>
+        <w:rPr>
+          <w:rFonts w:ascii="Cambria Math" w:hAnsi="Cambria Math" w:cs="Cambria Math"/>
+        </w:rPr>
+        <w:t>A o − j,    M = A / k,    W = r·M</w:t>
+      </w:r>
+      <w:r>
+        <w:rPr>
+          <w:rFonts w:ascii="Cambria Math" w:hAnsi="Cambria Math" w:cs="Cambria Math"/>
+          <w:vertAlign w:val="superscript"/>
+        </w:rPr>
+        <w:t>1/2</w:t>
+      </w:r>
+      <w:r>
+        <w:rPr>
+          <w:rFonts w:ascii="Cambria Math" w:hAnsi="Cambria Math" w:cs="Cambria Math"/>
+        </w:rPr>
+        <w:t>,    r = det(M)</w:t>
+      </w:r>
+      <w:r>
+        <w:rPr>
+          <w:rFonts w:ascii="Cambria Math" w:hAnsi="Cambria Math" w:cs="Cambria Math"/>
+          <w:vertAlign w:val="superscript"/>
+        </w:rPr>
+        <w:t>−</w:t>
+      </w:r>
+      <w:r>
+        <w:rPr>
+          <w:rFonts w:ascii="Cambria Math" w:hAnsi="Cambria Math" w:cs="Cambria Math"/>
+          <w:vertAlign w:val="superscript"/>
+        </w:rPr>
+        <w:t>1/6</w:t>
+      </w:r>
+    </w:p>
+    <w:p>
+      <w:r>
+        <w:t>M</w:t>
+      </w:r>
+      <w:r>
+        <w:rPr>
+          <w:vertAlign w:val="superscript"/>
+        </w:rPr>
+        <w:t>1/2</w:t>
+      </w:r>
+      <w:r>
+        <w:t xml:space="preserve"> wird über die Eigenzerlegung (Jacobi-Verfahren) berechnet. </w:t>
+      </w:r>
+      <w:r>
+        <w:rPr>
+          <w:b/>
+        </w:rPr>
+        <w:t>Datenauswahl:</w:t>
+      </w:r>
+      <w:r>
+        <w:t xml:space="preserve"> Richtungen werden in 26 Fächer einsortiert (höchstens 40 Proben je Fach, mindestens 4° Abstand zur vorigen Probe), damit langer Geradeausflug den Fit nicht dominiert. </w:t>
+      </w:r>
+      <w:r>
+        <w:rPr>
+          <w:b/>
+        </w:rPr>
+        <w:t>Annahme einer Lösung</w:t>
+      </w:r>
+      <w:r>
+        <w:t xml:space="preserve"> nur bei mindestens 14 belegten Fächern, ausreichender räumlicher Ve</w:t>
+      </w:r>
+      <w:r>
+        <w:t>rteilung (kleinster Eigenwert der Richtungsmatrix ≥ 0,12·n), positiv-definitem A, Achsverhältnis &lt; 2, |o| &lt; 300 µT, Radius 10–120 µT und Residuum &lt; 3 %.</w:t>
+      </w:r>
+    </w:p>
+    <w:p>
+      <w:pPr>
+        <w:pStyle w:val="Note"/>
+      </w:pPr>
+      <w:r>
+        <w:t>Im normalen Flug liegt der Feldvektor (Inklination ≈ 64°) nur in einem engen Kegel; der volle Ellipsoid</w:t>
+      </w:r>
+      <w:r>
+        <w:t>-Fit ist dann schlecht konditioniert. Er ist für das Drehen am Boden gedacht; das Ergebnis wird im Flash gespeichert.</w:t>
+      </w:r>
+    </w:p>
+    <w:p>
+      <w:pPr>
+        <w:pStyle w:val="berschrift2"/>
+      </w:pPr>
+      <w:bookmarkStart w:id="22" w:name="_Toc242137776"/>
+      <w:r>
+        <w:t>8.2 Lagegestützte Hart-Eisen-Nachführung (Flugbetrieb)</w:t>
+      </w:r>
+      <w:bookmarkEnd w:id="22"/>
+    </w:p>
+    <w:p>
+      <w:r>
+        <w:t>Mit der GNSS-gestützten Lage R</w:t>
       </w:r>
       <w:r>
         <w:rPr>
           <w:vertAlign w:val="subscript"/>
         </w:rPr>
-        <w:t>a</w:t>
-      </w:r>
-      <w:r>
-        <w:t xml:space="preserve"> und den Wind:</w:t>
+        <w:t>sn</w:t>
+      </w:r>
+      <w:r>
+        <w:t xml:space="preserve"> (Sensor → NED) ist das Modell linear in Erdfeld B</w:t>
+      </w:r>
+      <w:r>
+        <w:rPr>
+          <w:vertAlign w:val="subscript"/>
+        </w:rPr>
+        <w:t>n</w:t>
+      </w:r>
+      <w:r>
+        <w:t xml:space="preserve"> und Rest-Offset Δo:</w:t>
       </w:r>
     </w:p>
     <w:p>
@@ -7741,455 +8271,111 @@
         <w:rPr>
           <w:rFonts w:ascii="Cambria Math" w:hAnsi="Cambria Math" w:cs="Cambria Math"/>
         </w:rPr>
-        <w:t>v</w:t>
+        <w:t>m</w:t>
       </w:r>
       <w:r>
         <w:rPr>
           <w:rFonts w:ascii="Cambria Math" w:hAnsi="Cambria Math" w:cs="Cambria Math"/>
           <w:vertAlign w:val="subscript"/>
         </w:rPr>
-        <w:t>N</w:t>
-      </w:r>
-      <w:r>
-        <w:rPr>
-          <w:rFonts w:ascii="Cambria Math" w:hAnsi="Cambria Math" w:cs="Cambria Math"/>
-        </w:rPr>
-        <w:t xml:space="preserve"> = V</w:t>
+        <w:t>cal,s</w:t>
+      </w:r>
+      <w:r>
+        <w:rPr>
+          <w:rFonts w:ascii="Cambria Math" w:hAnsi="Cambria Math" w:cs="Cambria Math"/>
+        </w:rPr>
+        <w:t xml:space="preserve"> = R</w:t>
       </w:r>
       <w:r>
         <w:rPr>
           <w:rFonts w:ascii="Cambria Math" w:hAnsi="Cambria Math" w:cs="Cambria Math"/>
           <w:vertAlign w:val="subscript"/>
         </w:rPr>
-        <w:t>a</w:t>
-      </w:r>
-      <w:r>
-        <w:rPr>
-          <w:rFonts w:ascii="Cambria Math" w:hAnsi="Cambria Math" w:cs="Cambria Math"/>
-        </w:rPr>
-        <w:t>·cos ψ + w</w:t>
+        <w:t>sn</w:t>
+      </w:r>
+      <w:r>
+        <w:rPr>
+          <w:rFonts w:ascii="Cambria Math" w:hAnsi="Cambria Math" w:cs="Cambria Math"/>
+          <w:vertAlign w:val="superscript"/>
+        </w:rPr>
+        <w:t>T</w:t>
+      </w:r>
+      <w:r>
+        <w:rPr>
+          <w:rFonts w:ascii="Cambria Math" w:hAnsi="Cambria Math" w:cs="Cambria Math"/>
+        </w:rPr>
+        <w:t>·B</w:t>
       </w:r>
       <w:r>
         <w:rPr>
           <w:rFonts w:ascii="Cambria Math" w:hAnsi="Cambria Math" w:cs="Cambria Math"/>
           <w:vertAlign w:val="subscript"/>
         </w:rPr>
-        <w:t>N</w:t>
-      </w:r>
-      <w:r>
-        <w:rPr>
-          <w:rFonts w:ascii="Cambria Math" w:hAnsi="Cambria Math" w:cs="Cambria Math"/>
-        </w:rPr>
-        <w:t>,    v</w:t>
-      </w:r>
-      <w:r>
-        <w:rPr>
-          <w:rFonts w:ascii="Cambria Math" w:hAnsi="Cambria Math" w:cs="Cambria Math"/>
-          <w:vertAlign w:val="subscript"/>
-        </w:rPr>
-        <w:t>E</w:t>
-      </w:r>
-      <w:r>
-        <w:rPr>
-          <w:rFonts w:ascii="Cambria Math" w:hAnsi="Cambria Math" w:cs="Cambria Math"/>
-        </w:rPr>
-        <w:t xml:space="preserve"> = V</w:t>
-      </w:r>
-      <w:r>
-        <w:rPr>
-          <w:rFonts w:ascii="Cambria Math" w:hAnsi="Cambria Math" w:cs="Cambria Math"/>
-          <w:vertAlign w:val="subscript"/>
-        </w:rPr>
-        <w:t>a</w:t>
-      </w:r>
-      <w:r>
-        <w:rPr>
-          <w:rFonts w:ascii="Cambria Math" w:hAnsi="Cambria Math" w:cs="Cambria Math"/>
-        </w:rPr>
-        <w:t>·sin ψ + w</w:t>
-      </w:r>
-      <w:r>
-        <w:rPr>
-          <w:rFonts w:ascii="Cambria Math" w:hAnsi="Cambria Math" w:cs="Cambria Math"/>
-          <w:vertAlign w:val="subscript"/>
-        </w:rPr>
-        <w:t>E</w:t>
-      </w:r>
-    </w:p>
-    <w:p>
-      <w:r>
-        <w:t>Im Geradeausflug sind V</w:t>
-      </w:r>
-      <w:r>
-        <w:rPr>
-          <w:vertAlign w:val="subscript"/>
-        </w:rPr>
-        <w:t>a</w:t>
-      </w:r>
-      <w:r>
-        <w:t xml:space="preserve"> und Wind nicht trennbar; erst Kursänderungen machen sie beobachtbar. Die Kovarianz wird begrenzt (30 m/s bzw. 20 m/s), damit das Vergessen sie nicht unbegrenzt aufbläht. Ist der Wind bekannt, folgt der Anste</w:t>
-      </w:r>
-      <w:r>
-        <w:t>llwinkel als Tiefpass α̂ ← α̂ + 0,01·(atan2(v</w:t>
-      </w:r>
-      <w:r>
-        <w:rPr>
-          <w:vertAlign w:val="subscript"/>
-        </w:rPr>
-        <w:t>b,z</w:t>
-      </w:r>
-      <w:r>
-        <w:t>, v</w:t>
-      </w:r>
-      <w:r>
-        <w:rPr>
-          <w:vertAlign w:val="subscript"/>
-        </w:rPr>
-        <w:t>b,x</w:t>
-      </w:r>
-      <w:r>
-        <w:t>) − α̂); Startwert 2° (typischer Reiseflug).</w:t>
+        <w:t>n</w:t>
+      </w:r>
+      <w:r>
+        <w:rPr>
+          <w:rFonts w:ascii="Cambria Math" w:hAnsi="Cambria Math" w:cs="Cambria Math"/>
+        </w:rPr>
+        <w:t xml:space="preserve"> + Δo</w:t>
+      </w:r>
+    </w:p>
+    <w:p>
+      <w:r>
+        <w:t>Ein 6-Zustands-RLS (λ = 0,9995 je Probe, Messrauschen 0,5 µT) wird einmal pro Sekunde gefüttert, wenn GNSS gültig, die Kursunsicherheit &lt; 2°, die Drehrate &lt; 0,3 rad/s und die Grundgeschwindigkeit &gt; 15 m/s ist. Nac</w:t>
+      </w:r>
+      <w:r>
+        <w:t>h 200 Proben wird jede Offset-Komponente mit σ &lt; 0,7 µT und |Δo| &gt; 0,5 µT übernommen (o ← o + W</w:t>
+      </w:r>
+      <w:r>
+        <w:rPr>
+          <w:vertAlign w:val="superscript"/>
+        </w:rPr>
+        <w:t>−</w:t>
+      </w:r>
+      <w:r>
+        <w:rPr>
+          <w:vertAlign w:val="superscript"/>
+        </w:rPr>
+        <w:t>1</w:t>
+      </w:r>
+      <w:r>
+        <w:t>Δo). Kursänderungen machen die horizontalen Komponenten beobachtbar.</w:t>
       </w:r>
     </w:p>
     <w:p>
       <w:pPr>
         <w:pStyle w:val="berschrift1"/>
       </w:pPr>
-      <w:bookmarkStart w:id="20" w:name="_Toc242031849"/>
-      <w:r>
-        <w:t>8 Magnetometer-Kalibrierung</w:t>
-      </w:r>
-      <w:bookmarkEnd w:id="20"/>
-    </w:p>
-    <w:p>
-      <w:r>
-        <w:t>Kalibriertes Feld: m</w:t>
-      </w:r>
-      <w:r>
-        <w:rPr>
-          <w:vertAlign w:val="subscript"/>
-        </w:rPr>
-        <w:t>cal</w:t>
-      </w:r>
-      <w:r>
-        <w:t xml:space="preserve"> = W·(m</w:t>
-      </w:r>
-      <w:r>
-        <w:rPr>
-          <w:vertAlign w:val="subscript"/>
-        </w:rPr>
-        <w:t>roh</w:t>
-      </w:r>
-      <w:r>
-        <w:t xml:space="preserve"> − o) mit Hart-Eisen-Offset o und symmetrischer, volumentreuer Weich-Eisen-Matrix W. Die Kalibri</w:t>
-      </w:r>
-      <w:r>
-        <w:t>erung wird im Sensorsystem gerechnet und erst danach mit T ins Körpersystem gedreht.</w:t>
-      </w:r>
-    </w:p>
-    <w:p>
-      <w:pPr>
-        <w:pStyle w:val="berschrift2"/>
-      </w:pPr>
-      <w:bookmarkStart w:id="21" w:name="_Toc242031850"/>
-      <w:r>
-        <w:t>8.1 Ellipsoid-Fit mit RLS (nach Cao, Xu, Xu, Sensors 2020, 20, 535)</w:t>
-      </w:r>
-      <w:bookmarkEnd w:id="21"/>
-    </w:p>
-    <w:p>
-      <w:r>
-        <w:t>Die Messpunkte liegen auf einem Ellipsoid. Mit normierten Werten u = m/50 µT wird die Quadrik mit feste</w:t>
-      </w:r>
-      <w:r>
-        <w:t>m x²-Koeffizienten angesetzt – das bleibt stabil, auch wenn der Offset so groß wie das Feld ist:</w:t>
-      </w:r>
-    </w:p>
-    <w:p>
-      <w:pPr>
-        <w:pStyle w:val="Equation"/>
-      </w:pPr>
-      <w:r>
-        <w:rPr>
-          <w:rFonts w:ascii="Cambria Math" w:hAnsi="Cambria Math" w:cs="Cambria Math"/>
-        </w:rPr>
-        <w:t>x² + b·y² + c·z² + 2d·xy + 2e·xz + 2f·yz + 2g·x + 2h·y + 2i·z + j = 0</w:t>
-      </w:r>
-    </w:p>
-    <w:p>
-      <w:r>
-        <w:t>Die neun Parameter werden per RLS (doppelte Genauigkeit, ohne Vergessen) geschätzt. Lösun</w:t>
-      </w:r>
-      <w:r>
-        <w:t>g mit A = [[1, d, e], [d, b, f], [e, f, c]] und g = (g, h, i):</w:t>
-      </w:r>
-    </w:p>
-    <w:p>
-      <w:pPr>
-        <w:pStyle w:val="Equation"/>
-      </w:pPr>
-      <w:r>
-        <w:rPr>
-          <w:rFonts w:ascii="Cambria Math" w:hAnsi="Cambria Math" w:cs="Cambria Math"/>
-        </w:rPr>
-        <w:t>o = −A</w:t>
-      </w:r>
-      <w:r>
-        <w:rPr>
-          <w:rFonts w:ascii="Cambria Math" w:hAnsi="Cambria Math" w:cs="Cambria Math"/>
-          <w:vertAlign w:val="superscript"/>
-        </w:rPr>
-        <w:t>−</w:t>
-      </w:r>
-      <w:r>
-        <w:rPr>
-          <w:rFonts w:ascii="Cambria Math" w:hAnsi="Cambria Math" w:cs="Cambria Math"/>
-          <w:vertAlign w:val="superscript"/>
-        </w:rPr>
-        <w:t>1</w:t>
-      </w:r>
-      <w:r>
-        <w:rPr>
-          <w:rFonts w:ascii="Cambria Math" w:hAnsi="Cambria Math" w:cs="Cambria Math"/>
-        </w:rPr>
-        <w:t>·g,    k = o</w:t>
-      </w:r>
-      <w:r>
-        <w:rPr>
-          <w:rFonts w:ascii="Cambria Math" w:hAnsi="Cambria Math" w:cs="Cambria Math"/>
-          <w:vertAlign w:val="superscript"/>
-        </w:rPr>
-        <w:t>T</w:t>
-      </w:r>
-      <w:r>
-        <w:rPr>
-          <w:rFonts w:ascii="Cambria Math" w:hAnsi="Cambria Math" w:cs="Cambria Math"/>
-        </w:rPr>
-        <w:t>A o − j,    M = A / k,    W = r·M</w:t>
-      </w:r>
-      <w:r>
-        <w:rPr>
-          <w:rFonts w:ascii="Cambria Math" w:hAnsi="Cambria Math" w:cs="Cambria Math"/>
-          <w:vertAlign w:val="superscript"/>
-        </w:rPr>
-        <w:t>1/2</w:t>
-      </w:r>
-      <w:r>
-        <w:rPr>
-          <w:rFonts w:ascii="Cambria Math" w:hAnsi="Cambria Math" w:cs="Cambria Math"/>
-        </w:rPr>
-        <w:t>,    r = det(M)</w:t>
-      </w:r>
-      <w:r>
-        <w:rPr>
-          <w:rFonts w:ascii="Cambria Math" w:hAnsi="Cambria Math" w:cs="Cambria Math"/>
-          <w:vertAlign w:val="superscript"/>
-        </w:rPr>
-        <w:t>−</w:t>
-      </w:r>
-      <w:r>
-        <w:rPr>
-          <w:rFonts w:ascii="Cambria Math" w:hAnsi="Cambria Math" w:cs="Cambria Math"/>
-          <w:vertAlign w:val="superscript"/>
-        </w:rPr>
-        <w:t>1/6</w:t>
-      </w:r>
-    </w:p>
-    <w:p>
-      <w:r>
-        <w:t>M</w:t>
-      </w:r>
-      <w:r>
-        <w:rPr>
-          <w:vertAlign w:val="superscript"/>
-        </w:rPr>
-        <w:t>1/2</w:t>
-      </w:r>
-      <w:r>
-        <w:t xml:space="preserve"> wird über die Eigenzerlegung (Jacobi-Verfahren) berechnet. </w:t>
-      </w:r>
+      <w:bookmarkStart w:id="23" w:name="_Toc242137777"/>
+      <w:r>
+        <w:t>9 Missweisung</w:t>
+      </w:r>
+      <w:bookmarkEnd w:id="23"/>
+    </w:p>
+    <w:p>
+      <w:r>
+        <w:t xml:space="preserve">Das Filter rechnet geografisch (GNSS) und braucht deshalb die Missweisung D </w:t>
+      </w:r>
+      <w:r>
+        <w:t>als Zustand. Quellen in absteigender Güte:</w:t>
+      </w:r>
+    </w:p>
+    <w:p>
+      <w:pPr>
+        <w:pStyle w:val="Aufzhlungszeichen"/>
+      </w:pPr>
       <w:r>
         <w:rPr>
           <w:b/>
         </w:rPr>
-        <w:t>Datenauswahl:</w:t>
-      </w:r>
-      <w:r>
-        <w:t xml:space="preserve"> Richtungen werden in 26 Fächer einsort</w:t>
-      </w:r>
-      <w:r>
-        <w:t xml:space="preserve">iert (höchstens 40 Proben je Fach, mindestens 4° Abstand zur vorigen Probe), damit langer Geradeausflug den Fit nicht dominiert. </w:t>
-      </w:r>
-      <w:r>
-        <w:rPr>
-          <w:b/>
-        </w:rPr>
-        <w:t>Annahme einer Lösung</w:t>
-      </w:r>
-      <w:r>
-        <w:t xml:space="preserve"> nur bei mindestens 14 belegten Fächern, ausreichender räumlicher Verteilung (kleinster Eigenwert der Richtungsmatrix ≥ 0,12·n), positiv-definitem A, Achsverhältnis &lt; 2, |o| &lt; 300 µT, Radius 10–120 µT und Residuum &lt; 3 %.</w:t>
-      </w:r>
-    </w:p>
-    <w:p>
-      <w:pPr>
-        <w:pStyle w:val="Note"/>
-      </w:pPr>
-      <w:r>
-        <w:t>Im normalen Flug liegt der Feldvekt</w:t>
-      </w:r>
-      <w:r>
-        <w:t>or (Inklination ≈ 64°) nur in einem engen Kegel; der volle Ellipsoid-Fit ist dann schlecht konditioniert. Er ist für das Drehen am Boden gedacht; das Ergebnis wird im Flash gespeichert.</w:t>
-      </w:r>
-    </w:p>
-    <w:p>
-      <w:pPr>
-        <w:pStyle w:val="berschrift2"/>
-      </w:pPr>
-      <w:bookmarkStart w:id="22" w:name="_Toc242031851"/>
-      <w:r>
-        <w:t>8.2 Lagegestützte Hart-Eisen-Nachführung (Flugbetrieb)</w:t>
-      </w:r>
-      <w:bookmarkEnd w:id="22"/>
-    </w:p>
-    <w:p>
-      <w:r>
-        <w:t>Mit der GNSS-ge</w:t>
-      </w:r>
-      <w:r>
-        <w:t>stützten Lage R</w:t>
-      </w:r>
-      <w:r>
-        <w:rPr>
-          <w:vertAlign w:val="subscript"/>
-        </w:rPr>
-        <w:t>sn</w:t>
-      </w:r>
-      <w:r>
-        <w:t xml:space="preserve"> (Sensor → NED) ist das Modell linear in Erdfeld B</w:t>
-      </w:r>
-      <w:r>
-        <w:rPr>
-          <w:vertAlign w:val="subscript"/>
-        </w:rPr>
-        <w:t>n</w:t>
-      </w:r>
-      <w:r>
-        <w:t xml:space="preserve"> und Rest-Offset Δo:</w:t>
-      </w:r>
-    </w:p>
-    <w:p>
-      <w:pPr>
-        <w:pStyle w:val="Equation"/>
-      </w:pPr>
-      <w:r>
-        <w:rPr>
-          <w:rFonts w:ascii="Cambria Math" w:hAnsi="Cambria Math" w:cs="Cambria Math"/>
-        </w:rPr>
-        <w:t>m</w:t>
-      </w:r>
-      <w:r>
-        <w:rPr>
-          <w:rFonts w:ascii="Cambria Math" w:hAnsi="Cambria Math" w:cs="Cambria Math"/>
-          <w:vertAlign w:val="subscript"/>
-        </w:rPr>
-        <w:t>cal,s</w:t>
-      </w:r>
-      <w:r>
-        <w:rPr>
-          <w:rFonts w:ascii="Cambria Math" w:hAnsi="Cambria Math" w:cs="Cambria Math"/>
-        </w:rPr>
-        <w:t xml:space="preserve"> = R</w:t>
-      </w:r>
-      <w:r>
-        <w:rPr>
-          <w:rFonts w:ascii="Cambria Math" w:hAnsi="Cambria Math" w:cs="Cambria Math"/>
-          <w:vertAlign w:val="subscript"/>
-        </w:rPr>
-        <w:t>sn</w:t>
-      </w:r>
-      <w:r>
-        <w:rPr>
-          <w:rFonts w:ascii="Cambria Math" w:hAnsi="Cambria Math" w:cs="Cambria Math"/>
-          <w:vertAlign w:val="superscript"/>
-        </w:rPr>
-        <w:t>T</w:t>
-      </w:r>
-      <w:r>
-        <w:rPr>
-          <w:rFonts w:ascii="Cambria Math" w:hAnsi="Cambria Math" w:cs="Cambria Math"/>
-        </w:rPr>
-        <w:t>·B</w:t>
-      </w:r>
-      <w:r>
-        <w:rPr>
-          <w:rFonts w:ascii="Cambria Math" w:hAnsi="Cambria Math" w:cs="Cambria Math"/>
-          <w:vertAlign w:val="subscript"/>
-        </w:rPr>
-        <w:t>n</w:t>
-      </w:r>
-      <w:r>
-        <w:rPr>
-          <w:rFonts w:ascii="Cambria Math" w:hAnsi="Cambria Math" w:cs="Cambria Math"/>
-        </w:rPr>
-        <w:t xml:space="preserve"> + Δo</w:t>
-      </w:r>
-    </w:p>
-    <w:p>
-      <w:r>
-        <w:t>Ein 6-Zustands-RLS (λ = 0,9995 je Probe, Messrauschen 0,5 µT) wird einmal pro Sekunde gefüttert, wenn GNSS gültig, die Kursunsicherheit &lt; 2°, die</w:t>
-      </w:r>
-      <w:r>
-        <w:t xml:space="preserve"> Drehrate &lt; 0,3 rad/s und die Grundgeschwindigkeit &gt; 15 m/s ist. Nach 200 Proben wird jede Offset-Komponente mit σ &lt; 0,7 µT und |Δo| &gt; 0,5 µT übernommen (o ← o + W</w:t>
-      </w:r>
-      <w:r>
-        <w:rPr>
-          <w:vertAlign w:val="superscript"/>
-        </w:rPr>
-        <w:t>−</w:t>
-      </w:r>
-      <w:r>
-        <w:rPr>
-          <w:vertAlign w:val="superscript"/>
-        </w:rPr>
-        <w:t>1</w:t>
-      </w:r>
-      <w:r>
-        <w:t>Δo). Kursänderungen machen die horizontalen Komponenten beobachtbar.</w:t>
-      </w:r>
-    </w:p>
-    <w:p>
-      <w:pPr>
-        <w:pStyle w:val="berschrift1"/>
-      </w:pPr>
-      <w:bookmarkStart w:id="23" w:name="_Toc242031852"/>
-      <w:r>
-        <w:t>9 Missweisung</w:t>
-      </w:r>
-      <w:bookmarkEnd w:id="23"/>
-    </w:p>
-    <w:p>
-      <w:r>
-        <w:t>Das Filt</w:t>
-      </w:r>
-      <w:r>
-        <w:t>er rechnet geografisch (GNSS) und braucht deshalb die Missweisung D als Zustand. Quellen in absteigender Güte:</w:t>
-      </w:r>
-    </w:p>
-    <w:p>
-      <w:pPr>
-        <w:pStyle w:val="Aufzhlungszeichen"/>
-      </w:pPr>
-      <w:r>
-        <w:rPr>
-          <w:b/>
-        </w:rPr>
         <w:t>EFIS (WMM):</w:t>
       </w:r>
       <w:r>
-        <w:t xml:space="preserve"> Das EFIS sendet einmal pro Sekunde CAN-ID 1121 für die aktuelle GNSS-Position. Jeder Wert ist eine Messung h(x) = D mit σ = 0,5°; vor</w:t>
-      </w:r>
-      <w:r>
-        <w:t xml:space="preserve"> der Ausrichtung wird er als Startwert genommen. Angenommen wird 1121 nur von der Node-ID </w:t>
+        <w:t xml:space="preserve"> Das EFIS sendet einmal pro Sekunde CAN-ID 1121 für die aktuelle GNSS-Position. Jeder Wert ist eine Messung h(x) = D mit σ = 0,5°; vor der Ausrichtung wird er als Startwert genommen. Angenommen wird 112</w:t>
+      </w:r>
+      <w:r>
+        <w:t xml:space="preserve">1 nur von der Node-ID </w:t>
       </w:r>
       <w:r>
         <w:rPr>
@@ -8227,278 +8413,272 @@
         <w:t>Schätzung:</w:t>
       </w:r>
       <w:r>
-        <w:t xml:space="preserve"> Ohne beides startet D m</w:t>
-      </w:r>
-      <w:r>
-        <w:t>it 0 ± 20° und wird im Kurvenflug mit GNSS geschätzt.</w:t>
+        <w:t xml:space="preserve"> Ohne beides startet D mit 0 ± 20° und wird im Kurvenflug mit GNSS geschätzt.</w:t>
+      </w:r>
+    </w:p>
+    <w:p>
+      <w:r>
+        <w:t xml:space="preserve">Gesendet wird </w:t>
+      </w:r>
+      <w:r>
+        <w:t>der missweisende Steuerkurs ψ − D. Dieser hängt kaum von D ab, weil das Magnetometer genau diese Differenz misst; D wirkt sich vor allem auf die Kopplung mit den GNSS-Geschwindigkeiten aus.</w:t>
+      </w:r>
+    </w:p>
+    <w:p>
+      <w:pPr>
+        <w:pStyle w:val="berschrift1"/>
+      </w:pPr>
+      <w:bookmarkStart w:id="24" w:name="_Toc242137778"/>
+      <w:r>
+        <w:t>10 Einbaukalibrierung</w:t>
+      </w:r>
+      <w:bookmarkEnd w:id="24"/>
+    </w:p>
+    <w:p>
+      <w:r>
+        <w:t xml:space="preserve">Die Platine muss nur grob ausgerichtet sein </w:t>
+      </w:r>
+      <w:r>
+        <w:t>(Neigung bis 10°, Verdrehung bis 30°). Die Feinkorrektur ist eine Drehung v</w:t>
+      </w:r>
+      <w:r>
+        <w:rPr>
+          <w:vertAlign w:val="subscript"/>
+        </w:rPr>
+        <w:t>b</w:t>
+      </w:r>
+      <w:r>
+        <w:t xml:space="preserve"> = T·v</w:t>
+      </w:r>
+      <w:r>
+        <w:rPr>
+          <w:vertAlign w:val="subscript"/>
+        </w:rPr>
+        <w:t>s</w:t>
+      </w:r>
+      <w:r>
+        <w:t xml:space="preserve"> mit T = R(φ</w:t>
+      </w:r>
+      <w:r>
+        <w:rPr>
+          <w:vertAlign w:val="subscript"/>
+        </w:rPr>
+        <w:t>0</w:t>
+      </w:r>
+      <w:r>
+        <w:t>, θ</w:t>
+      </w:r>
+      <w:r>
+        <w:rPr>
+          <w:vertAlign w:val="subscript"/>
+        </w:rPr>
+        <w:t>0</w:t>
+      </w:r>
+      <w:r>
+        <w:t>, ψ</w:t>
+      </w:r>
+      <w:r>
+        <w:rPr>
+          <w:vertAlign w:val="subscript"/>
+        </w:rPr>
+        <w:t>0</w:t>
+      </w:r>
+      <w:r>
+        <w:t>), angewandt auf Drehrate, Beschleunigung und kalibriertes Magnetfeld.</w:t>
+      </w:r>
+    </w:p>
+    <w:p>
+      <w:pPr>
+        <w:pStyle w:val="berschrift2"/>
+      </w:pPr>
+      <w:bookmarkStart w:id="25" w:name="_Toc242137779"/>
+      <w:r>
+        <w:t>10.1 Nivellieren (Service 100)</w:t>
+      </w:r>
+      <w:bookmarkEnd w:id="25"/>
+    </w:p>
+    <w:p>
+      <w:r>
+        <w:t>Das Flugzeug steht still in Fluglage (Nivelliermar</w:t>
+      </w:r>
+      <w:r>
+        <w:t>ken). Über 2 s wird die spezifische Kraft im Sensorsystem gemittelt; die daraus berechnete Lage der Platine ist der Einbauversatz:</w:t>
+      </w:r>
+    </w:p>
+    <w:p>
+      <w:pPr>
+        <w:pStyle w:val="Equation"/>
+      </w:pPr>
+      <w:r>
+        <w:rPr>
+          <w:rFonts w:ascii="Cambria Math" w:hAnsi="Cambria Math" w:cs="Cambria Math"/>
+        </w:rPr>
+        <w:t>φ</w:t>
+      </w:r>
+      <w:r>
+        <w:rPr>
+          <w:rFonts w:ascii="Cambria Math" w:hAnsi="Cambria Math" w:cs="Cambria Math"/>
+          <w:vertAlign w:val="subscript"/>
+        </w:rPr>
+        <w:t>0</w:t>
+      </w:r>
+      <w:r>
+        <w:rPr>
+          <w:rFonts w:ascii="Cambria Math" w:hAnsi="Cambria Math" w:cs="Cambria Math"/>
+        </w:rPr>
+        <w:t xml:space="preserve"> = atan2(−f̄</w:t>
+      </w:r>
+      <w:r>
+        <w:rPr>
+          <w:rFonts w:ascii="Cambria Math" w:hAnsi="Cambria Math" w:cs="Cambria Math"/>
+          <w:vertAlign w:val="subscript"/>
+        </w:rPr>
+        <w:t>y</w:t>
+      </w:r>
+      <w:r>
+        <w:rPr>
+          <w:rFonts w:ascii="Cambria Math" w:hAnsi="Cambria Math" w:cs="Cambria Math"/>
+        </w:rPr>
+        <w:t>, −f̄</w:t>
+      </w:r>
+      <w:r>
+        <w:rPr>
+          <w:rFonts w:ascii="Cambria Math" w:hAnsi="Cambria Math" w:cs="Cambria Math"/>
+          <w:vertAlign w:val="subscript"/>
+        </w:rPr>
+        <w:t>z</w:t>
+      </w:r>
+      <w:r>
+        <w:rPr>
+          <w:rFonts w:ascii="Cambria Math" w:hAnsi="Cambria Math" w:cs="Cambria Math"/>
+        </w:rPr>
+        <w:t>),    θ</w:t>
+      </w:r>
+      <w:r>
+        <w:rPr>
+          <w:rFonts w:ascii="Cambria Math" w:hAnsi="Cambria Math" w:cs="Cambria Math"/>
+          <w:vertAlign w:val="subscript"/>
+        </w:rPr>
+        <w:t>0</w:t>
+      </w:r>
+      <w:r>
+        <w:rPr>
+          <w:rFonts w:ascii="Cambria Math" w:hAnsi="Cambria Math" w:cs="Cambria Math"/>
+        </w:rPr>
+        <w:t xml:space="preserve"> = atan2(f̄</w:t>
+      </w:r>
+      <w:r>
+        <w:rPr>
+          <w:rFonts w:ascii="Cambria Math" w:hAnsi="Cambria Math" w:cs="Cambria Math"/>
+          <w:vertAlign w:val="subscript"/>
+        </w:rPr>
+        <w:t>x</w:t>
+      </w:r>
+      <w:r>
+        <w:rPr>
+          <w:rFonts w:ascii="Cambria Math" w:hAnsi="Cambria Math" w:cs="Cambria Math"/>
+        </w:rPr>
+        <w:t>, √(f̄</w:t>
+      </w:r>
+      <w:r>
+        <w:rPr>
+          <w:rFonts w:ascii="Cambria Math" w:hAnsi="Cambria Math" w:cs="Cambria Math"/>
+          <w:vertAlign w:val="subscript"/>
+        </w:rPr>
+        <w:t>y</w:t>
+      </w:r>
+      <w:r>
+        <w:rPr>
+          <w:rFonts w:ascii="Cambria Math" w:hAnsi="Cambria Math" w:cs="Cambria Math"/>
+        </w:rPr>
+        <w:t>² + f̄</w:t>
+      </w:r>
+      <w:r>
+        <w:rPr>
+          <w:rFonts w:ascii="Cambria Math" w:hAnsi="Cambria Math" w:cs="Cambria Math"/>
+          <w:vertAlign w:val="subscript"/>
+        </w:rPr>
+        <w:t>z</w:t>
+      </w:r>
+      <w:r>
+        <w:rPr>
+          <w:rFonts w:ascii="Cambria Math" w:hAnsi="Cambria Math" w:cs="Cambria Math"/>
+        </w:rPr>
+        <w:t>²))</w:t>
       </w:r>
     </w:p>
     <w:p>
       <w:r>
         <w:lastRenderedPageBreak/>
-        <w:t>Gesendet wird der missweisende Steuerkurs ψ − D. Dieser hängt kaum von D ab, weil das Magnetometer genau diese Differenz misst; D wirkt sich vor allem auf die Kopplung mit den GNSS-Geschwindigkeiten aus</w:t>
-      </w:r>
-      <w:r>
-        <w:t>.</w:t>
+        <w:t>Ein konstanter Fehler des Beschleunigungsmessers wird dabei mit abgeglichen.</w:t>
+      </w:r>
+    </w:p>
+    <w:p>
+      <w:pPr>
+        <w:pStyle w:val="berschrift2"/>
+      </w:pPr>
+      <w:bookmarkStart w:id="26" w:name="_Toc242137780"/>
+      <w:r>
+        <w:t>10.2 Kursabgleich (Service 101)</w:t>
+      </w:r>
+      <w:bookmarkEnd w:id="26"/>
+    </w:p>
+    <w:p>
+      <w:r>
+        <w:t>Das Flugzeug steht auf einem bekannten missweisenden Kurs H</w:t>
+      </w:r>
+      <w:r>
+        <w:rPr>
+          <w:vertAlign w:val="subscript"/>
+        </w:rPr>
+        <w:t>ref</w:t>
+      </w:r>
+      <w:r>
+        <w:t>. Mit dem angezeigten Kurs H gilt ψ</w:t>
+      </w:r>
+      <w:r>
+        <w:rPr>
+          <w:vertAlign w:val="subscript"/>
+        </w:rPr>
+        <w:t>0</w:t>
+      </w:r>
+      <w:r>
+        <w:t xml:space="preserve"> ← ψ</w:t>
+      </w:r>
+      <w:r>
+        <w:rPr>
+          <w:vertAlign w:val="subscript"/>
+        </w:rPr>
+        <w:t>0</w:t>
+      </w:r>
+      <w:r>
+        <w:t xml:space="preserve"> + (H − H</w:t>
+      </w:r>
+      <w:r>
+        <w:rPr>
+          <w:vertAlign w:val="subscript"/>
+        </w:rPr>
+        <w:t>ref</w:t>
+      </w:r>
+      <w:r>
+        <w:t>).</w:t>
+      </w:r>
+    </w:p>
+    <w:p>
+      <w:r>
+        <w:t>Beide Verfahren werden abgele</w:t>
+      </w:r>
+      <w:r>
+        <w:t>hnt, wenn das Flugzeug nicht still am Boden steht, der Versatz zu groß ist oder das AHRS noch nicht bereit ist. Danach richtet sich das Filter neu aus (≈ 1 s ungültig); die Werte werden im Flash gespeichert.</w:t>
       </w:r>
     </w:p>
     <w:p>
       <w:pPr>
         <w:pStyle w:val="berschrift1"/>
       </w:pPr>
-      <w:bookmarkStart w:id="24" w:name="_Toc242031853"/>
-      <w:r>
-        <w:t>10 Einbaukalibrierung</w:t>
-      </w:r>
-      <w:bookmarkEnd w:id="24"/>
-    </w:p>
-    <w:p>
-      <w:r>
-        <w:t>Die Platine muss nur grob ausgerichtet sein (Neigung bis 10°, Verdrehung bis 30°). Die Feinkorrektur ist eine Drehung v</w:t>
-      </w:r>
-      <w:r>
-        <w:rPr>
-          <w:vertAlign w:val="subscript"/>
-        </w:rPr>
-        <w:t>b</w:t>
-      </w:r>
-      <w:r>
-        <w:t xml:space="preserve"> = T·v</w:t>
-      </w:r>
-      <w:r>
-        <w:rPr>
-          <w:vertAlign w:val="subscript"/>
-        </w:rPr>
-        <w:t>s</w:t>
-      </w:r>
-      <w:r>
-        <w:t xml:space="preserve"> mit T = R(φ</w:t>
-      </w:r>
-      <w:r>
-        <w:rPr>
-          <w:vertAlign w:val="subscript"/>
-        </w:rPr>
-        <w:t>0</w:t>
-      </w:r>
-      <w:r>
-        <w:t>, θ</w:t>
-      </w:r>
-      <w:r>
-        <w:rPr>
-          <w:vertAlign w:val="subscript"/>
-        </w:rPr>
-        <w:t>0</w:t>
-      </w:r>
-      <w:r>
-        <w:t>, ψ</w:t>
-      </w:r>
-      <w:r>
-        <w:rPr>
-          <w:vertAlign w:val="subscript"/>
-        </w:rPr>
-        <w:t>0</w:t>
-      </w:r>
-      <w:r>
-        <w:t>), angewandt auf Drehrate, Beschleunigung und kalibriertes Magnetfeld.</w:t>
-      </w:r>
-    </w:p>
-    <w:p>
-      <w:pPr>
-        <w:pStyle w:val="berschrift2"/>
-      </w:pPr>
-      <w:bookmarkStart w:id="25" w:name="_Toc242031854"/>
-      <w:r>
-        <w:t>10.1 Nivellie</w:t>
-      </w:r>
-      <w:r>
-        <w:t>ren (Service 100)</w:t>
-      </w:r>
-      <w:bookmarkEnd w:id="25"/>
-    </w:p>
-    <w:p>
-      <w:r>
-        <w:t>Das Flugzeug steht still in Fluglage (Nivelliermarken). Über 2 s wird die spezifische Kraft im Sensorsystem gemittelt; die daraus berechnete Lage der Platine ist der Einbauversatz:</w:t>
-      </w:r>
-    </w:p>
-    <w:p>
-      <w:pPr>
-        <w:pStyle w:val="Equation"/>
-      </w:pPr>
-      <w:r>
-        <w:rPr>
-          <w:rFonts w:ascii="Cambria Math" w:hAnsi="Cambria Math" w:cs="Cambria Math"/>
-        </w:rPr>
-        <w:t>φ</w:t>
-      </w:r>
-      <w:r>
-        <w:rPr>
-          <w:rFonts w:ascii="Cambria Math" w:hAnsi="Cambria Math" w:cs="Cambria Math"/>
-          <w:vertAlign w:val="subscript"/>
-        </w:rPr>
-        <w:t>0</w:t>
-      </w:r>
-      <w:r>
-        <w:rPr>
-          <w:rFonts w:ascii="Cambria Math" w:hAnsi="Cambria Math" w:cs="Cambria Math"/>
-        </w:rPr>
-        <w:t xml:space="preserve"> = atan2(−f̄</w:t>
-      </w:r>
-      <w:r>
-        <w:rPr>
-          <w:rFonts w:ascii="Cambria Math" w:hAnsi="Cambria Math" w:cs="Cambria Math"/>
-          <w:vertAlign w:val="subscript"/>
-        </w:rPr>
-        <w:t>y</w:t>
-      </w:r>
-      <w:r>
-        <w:rPr>
-          <w:rFonts w:ascii="Cambria Math" w:hAnsi="Cambria Math" w:cs="Cambria Math"/>
-        </w:rPr>
-        <w:t>, −f̄</w:t>
-      </w:r>
-      <w:r>
-        <w:rPr>
-          <w:rFonts w:ascii="Cambria Math" w:hAnsi="Cambria Math" w:cs="Cambria Math"/>
-          <w:vertAlign w:val="subscript"/>
-        </w:rPr>
-        <w:t>z</w:t>
-      </w:r>
-      <w:r>
-        <w:rPr>
-          <w:rFonts w:ascii="Cambria Math" w:hAnsi="Cambria Math" w:cs="Cambria Math"/>
-        </w:rPr>
-        <w:t>),    θ</w:t>
-      </w:r>
-      <w:r>
-        <w:rPr>
-          <w:rFonts w:ascii="Cambria Math" w:hAnsi="Cambria Math" w:cs="Cambria Math"/>
-          <w:vertAlign w:val="subscript"/>
-        </w:rPr>
-        <w:t>0</w:t>
-      </w:r>
-      <w:r>
-        <w:rPr>
-          <w:rFonts w:ascii="Cambria Math" w:hAnsi="Cambria Math" w:cs="Cambria Math"/>
-        </w:rPr>
-        <w:t xml:space="preserve"> = atan2(f̄</w:t>
-      </w:r>
-      <w:r>
-        <w:rPr>
-          <w:rFonts w:ascii="Cambria Math" w:hAnsi="Cambria Math" w:cs="Cambria Math"/>
-          <w:vertAlign w:val="subscript"/>
-        </w:rPr>
-        <w:t>x</w:t>
-      </w:r>
-      <w:r>
-        <w:rPr>
-          <w:rFonts w:ascii="Cambria Math" w:hAnsi="Cambria Math" w:cs="Cambria Math"/>
-        </w:rPr>
-        <w:t>, √(f̄</w:t>
-      </w:r>
-      <w:r>
-        <w:rPr>
-          <w:rFonts w:ascii="Cambria Math" w:hAnsi="Cambria Math" w:cs="Cambria Math"/>
-          <w:vertAlign w:val="subscript"/>
-        </w:rPr>
-        <w:t>y</w:t>
-      </w:r>
-      <w:r>
-        <w:rPr>
-          <w:rFonts w:ascii="Cambria Math" w:hAnsi="Cambria Math" w:cs="Cambria Math"/>
-        </w:rPr>
-        <w:t>² + f̄</w:t>
-      </w:r>
-      <w:r>
-        <w:rPr>
-          <w:rFonts w:ascii="Cambria Math" w:hAnsi="Cambria Math" w:cs="Cambria Math"/>
-          <w:vertAlign w:val="subscript"/>
-        </w:rPr>
-        <w:t>z</w:t>
-      </w:r>
-      <w:r>
-        <w:rPr>
-          <w:rFonts w:ascii="Cambria Math" w:hAnsi="Cambria Math" w:cs="Cambria Math"/>
-        </w:rPr>
-        <w:t>²)</w:t>
-      </w:r>
-      <w:r>
-        <w:rPr>
-          <w:rFonts w:ascii="Cambria Math" w:hAnsi="Cambria Math" w:cs="Cambria Math"/>
-        </w:rPr>
-        <w:t>)</w:t>
-      </w:r>
-    </w:p>
-    <w:p>
-      <w:r>
-        <w:t>Ein konstanter Fehler des Beschleunigungsmessers wird dabei mit abgeglichen.</w:t>
-      </w:r>
-    </w:p>
-    <w:p>
-      <w:pPr>
-        <w:pStyle w:val="berschrift2"/>
-      </w:pPr>
-      <w:bookmarkStart w:id="26" w:name="_Toc242031855"/>
-      <w:r>
-        <w:t>10.2 Kursabgleich (Service 101)</w:t>
-      </w:r>
-      <w:bookmarkEnd w:id="26"/>
-    </w:p>
-    <w:p>
-      <w:r>
-        <w:t>Das Flugzeug steht auf einem bekannten missweisenden Kurs H</w:t>
-      </w:r>
-      <w:r>
-        <w:rPr>
-          <w:vertAlign w:val="subscript"/>
-        </w:rPr>
-        <w:t>ref</w:t>
-      </w:r>
-      <w:r>
-        <w:t>. Mit dem angezeigten Kurs H gilt ψ</w:t>
-      </w:r>
-      <w:r>
-        <w:rPr>
-          <w:vertAlign w:val="subscript"/>
-        </w:rPr>
-        <w:t>0</w:t>
-      </w:r>
-      <w:r>
-        <w:t xml:space="preserve"> ← ψ</w:t>
-      </w:r>
-      <w:r>
-        <w:rPr>
-          <w:vertAlign w:val="subscript"/>
-        </w:rPr>
-        <w:t>0</w:t>
-      </w:r>
-      <w:r>
-        <w:t xml:space="preserve"> + (H − H</w:t>
-      </w:r>
-      <w:r>
-        <w:rPr>
-          <w:vertAlign w:val="subscript"/>
-        </w:rPr>
-        <w:t>ref</w:t>
-      </w:r>
-      <w:r>
-        <w:t>).</w:t>
-      </w:r>
-    </w:p>
-    <w:p>
-      <w:r>
-        <w:t>Beide Verfahren werden abgelehnt, wenn das Flugzeug nicht still am Boden steht, der Versatz zu groß ist oder das AHRS noch nicht bereit ist. Danach richtet sich das Filter neu aus (≈ 1 s ungültig); die Werte werden im Flash gespeichert.</w:t>
-      </w:r>
-    </w:p>
-    <w:p>
-      <w:pPr>
-        <w:pStyle w:val="berschrift1"/>
-      </w:pPr>
-      <w:bookmarkStart w:id="27" w:name="_Toc242031856"/>
-      <w:r>
-        <w:t>11 Ausgaben und Gül</w:t>
-      </w:r>
-      <w:r>
-        <w:t>tigkeit</w:t>
+      <w:bookmarkStart w:id="27" w:name="_Toc242137781"/>
+      <w:r>
+        <w:t>11 Ausgaben und Gültigkeit</w:t>
       </w:r>
       <w:bookmarkEnd w:id="27"/>
     </w:p>
@@ -8578,7 +8758,13 @@
               <w:rPr>
                 <w:b/>
               </w:rPr>
-              <w:t>Gültig, wenn</w:t>
+              <w:t>Gü</w:t>
+            </w:r>
+            <w:r>
+              <w:rPr>
+                <w:b/>
+              </w:rPr>
+              <w:t>ltig, wenn</w:t>
             </w:r>
           </w:p>
         </w:tc>
@@ -9049,7 +9235,7 @@
       <w:pPr>
         <w:pStyle w:val="berschrift1"/>
       </w:pPr>
-      <w:bookmarkStart w:id="28" w:name="_Toc242031857"/>
+      <w:bookmarkStart w:id="28" w:name="_Toc242137782"/>
       <w:r>
         <w:t>12 Fehler- und Ausfallbehandlung (Übersicht)</w:t>
       </w:r>
@@ -9324,7 +9510,10 @@
               <w:pStyle w:val="TableText"/>
             </w:pPr>
             <w:r>
-              <w:t>Feldstärke ±12 %, Inklination ±8°, χ²-Tor</w:t>
+              <w:t>Feldstärke ±12 %, Inklination ±8°, χ²</w:t>
+            </w:r>
+            <w:r>
+              <w:t>-Tor</w:t>
             </w:r>
           </w:p>
         </w:tc>
@@ -9420,7 +9609,6 @@
               <w:pStyle w:val="TableText"/>
             </w:pPr>
             <w:r>
-              <w:lastRenderedPageBreak/>
               <w:t>Barometer ausgefallen</w:t>
             </w:r>
           </w:p>
@@ -9434,7 +9622,10 @@
               <w:pStyle w:val="TableText"/>
             </w:pPr>
             <w:r>
-              <w:t>Wert älter als 0,5 s oder außerhalb 200–1100 hPa</w:t>
+              <w:t xml:space="preserve">Wert älter als 0,5 s oder außerhalb </w:t>
+            </w:r>
+            <w:r>
+              <w:t>200–1100 hPa</w:t>
             </w:r>
           </w:p>
         </w:tc>
@@ -9715,7 +9906,7 @@
       <w:pPr>
         <w:pStyle w:val="berschrift1"/>
       </w:pPr>
-      <w:bookmarkStart w:id="29" w:name="_Toc242031858"/>
+      <w:bookmarkStart w:id="29" w:name="_Toc242137783"/>
       <w:r>
         <w:t>13 Einstellbare Parameter</w:t>
       </w:r>
@@ -9985,6 +10176,7 @@
                 <w:rFonts w:ascii="Consolas" w:hAnsi="Consolas" w:cs="Consolas"/>
                 <w:sz w:val="19"/>
               </w:rPr>
+              <w:lastRenderedPageBreak/>
               <w:t>gnss_reset_s</w:t>
             </w:r>
           </w:p>
@@ -10621,7 +10813,7 @@
       <w:pPr>
         <w:pStyle w:val="berschrift1"/>
       </w:pPr>
-      <w:bookmarkStart w:id="30" w:name="_Toc242031859"/>
+      <w:bookmarkStart w:id="30" w:name="_Toc242137784"/>
       <w:r>
         <w:t>14 Verifikation (Simulation)</w:t>
       </w:r>
@@ -11001,7 +11193,7 @@
       <w:pPr>
         <w:pStyle w:val="berschrift1"/>
       </w:pPr>
-      <w:bookmarkStart w:id="31" w:name="_Toc242031860"/>
+      <w:bookmarkStart w:id="31" w:name="_Toc242137785"/>
       <w:r>
         <w:t>15 Grenzen und offene Punkte</w:t>
       </w:r>
@@ -11050,12 +11242,11 @@
         <w:pStyle w:val="Aufzhlungszeichen"/>
       </w:pPr>
       <w:r>
-        <w:lastRenderedPageBreak/>
         <w:t>Der volle Ellipsoid-Fit braucht Bewegung in allen Achsen (Drehen am Boden); im Flug wird nur der Hart-Eisen-Offset nachgeführt.</w:t>
       </w:r>
     </w:p>
     <w:sectPr>
-      <w:footerReference w:type="default" r:id="rId7"/>
+      <w:footerReference w:type="default" r:id="rId13"/>
       <w:pgSz w:w="11906" w:h="16838"/>
       <w:pgMar w:top="1134" w:right="1134" w:bottom="1134" w:left="1134" w:header="567" w:footer="567" w:gutter="0"/>
       <w:cols w:space="720"/>
@@ -11169,9 +11360,9 @@
 <file path=word/numbering.xml><?xml version="1.0" encoding="utf-8"?>
 <w:numbering xmlns:wpc="http://schemas.microsoft.com/office/word/2010/wordprocessingCanvas" xmlns:cx="http://schemas.microsoft.com/office/drawing/2014/chartex" xmlns:cx1="http://schemas.microsoft.com/office/drawing/2015/9/8/chartex" xmlns:cx2="http://schemas.microsoft.com/office/drawing/2015/10/21/chartex" xmlns:cx3="http://schemas.microsoft.com/office/drawing/2016/5/9/chartex" xmlns:cx4="http://schemas.microsoft.com/office/drawing/2016/5/10/chartex" xmlns:cx5="http://schemas.microsoft.com/office/drawing/2016/5/11/chartex" xmlns:cx6="http://schemas.microsoft.com/office/drawing/2016/5/12/chartex" xmlns:cx7="http://schemas.microsoft.com/office/drawing/2016/5/13/chartex" xmlns:cx8="http://schemas.microsoft.com/office/drawing/2016/5/14/chartex" xmlns:mc="http://schemas.openxmlformats.org/markup-compatibility/2006" xmlns:aink="http://schemas.microsoft.com/office/drawing/2016/ink" xmlns:am3d="http://schemas.microsoft.com/office/drawing/2017/model3d" xmlns:o="urn:schemas-microsoft-com:office:office" xmlns:r="http://schemas.openxmlformats.org/officeDocument/2006/relationships" xmlns:m="http://schemas.openxmlformats.org/officeDocument/2006/math" xmlns:v="urn:schemas-microsoft-com:vml" xmlns:wp14="http://schemas.microsoft.com/office/word/2010/wordprocessingDrawing" xmlns:wp="http://schemas.openxmlformats.org/drawingml/2006/wordprocessingDrawing" xmlns:w10="urn:schemas-microsoft-com:office:word" xmlns:w="http://schemas.openxmlformats.org/wordprocessingml/2006/main" xmlns:w14="http://schemas.microsoft.com/office/word/2010/wordml" xmlns:w15="http://schemas.microsoft.com/office/word/2012/wordml" xmlns:w16cex="http://schemas.microsoft.com/office/word/2018/wordml/cex" xmlns:w16cid="http://schemas.microsoft.com/office/word/2016/wordml/cid" xmlns:w16="http://schemas.microsoft.com/office/word/2018/wordml" xmlns:w16sdtdh="http://schemas.microsoft.com/office/word/2020/wordml/sdtdatahash" xmlns:w16se="http://schemas.microsoft.com/office/word/2015/wordml/symex" xmlns:wpg="http://schemas.microsoft.com/office/word/2010/wordprocessingGroup" xmlns:wpi="http://schemas.microsoft.com/office/word/2010/wordprocessingInk" xmlns:wne="http://schemas.microsoft.com/office/word/2006/wordml" xmlns:wps="http://schemas.microsoft.com/office/word/2010/wordprocessingShape" mc:Ignorable="w14 w15 w16se w16cid w16 w16cex w16sdtdh wp14">
   <w:abstractNum w:abstractNumId="0" w15:restartNumberingAfterBreak="0">
-    <w:nsid w:val="7EE31D8B"/>
+    <w:nsid w:val="068660E9"/>
     <w:multiLevelType w:val="singleLevel"/>
-    <w:tmpl w:val="07BAAC6A"/>
+    <w:tmpl w:val="36D84E38"/>
     <w:lvl w:ilvl="0">
       <w:start w:val="1"/>
       <w:numFmt w:val="bullet"/>
@@ -11722,6 +11913,30 @@
       <w:sz w:val="20"/>
     </w:rPr>
   </w:style>
+  <w:style w:type="paragraph" w:customStyle="1" w:styleId="Figure">
+    <w:name w:val="Figure"/>
+    <w:basedOn w:val="Standard"/>
+    <w:qFormat/>
+    <w:pPr>
+      <w:keepNext/>
+      <w:spacing w:before="120" w:after="40"/>
+      <w:jc w:val="center"/>
+    </w:pPr>
+  </w:style>
+  <w:style w:type="paragraph" w:styleId="Beschriftung">
+    <w:name w:val="caption"/>
+    <w:basedOn w:val="Standard"/>
+    <w:qFormat/>
+    <w:pPr>
+      <w:spacing w:after="200"/>
+      <w:jc w:val="center"/>
+    </w:pPr>
+    <w:rPr>
+      <w:i/>
+      <w:color w:val="595959"/>
+      <w:sz w:val="18"/>
+    </w:rPr>
+  </w:style>
   <w:style w:type="paragraph" w:customStyle="1" w:styleId="TableText">
     <w:name w:val="Table Text"/>
     <w:basedOn w:val="Standard"/>
@@ -11820,7 +12035,7 @@
     <w:basedOn w:val="Absatz-Standardschriftart"/>
     <w:uiPriority w:val="99"/>
     <w:unhideWhenUsed/>
-    <w:rsid w:val="00EC50BD"/>
+    <w:rsid w:val="00C73236"/>
     <w:rPr>
       <w:color w:val="0563C1" w:themeColor="hyperlink"/>
       <w:u w:val="single"/>

</xml_diff>